<commit_message>
chore: update text content for Kumwell product posters
</commit_message>
<xml_diff>
--- a/public/Images/kumwell/Posters/7.Kumwell Lighnting Protection System Components (TEXT).docx
+++ b/public/Images/kumwell/Posters/7.Kumwell Lighnting Protection System Components (TEXT).docx
@@ -1,16 +1,17 @@
 
 <file path=word/document.xml><?xml version="1.0" encoding="utf-8"?>
-<w:document xmlns:wpc="http://schemas.microsoft.com/office/word/2010/wordprocessingCanvas" xmlns:cx="http://schemas.microsoft.com/office/drawing/2014/chartex" xmlns:cx1="http://schemas.microsoft.com/office/drawing/2015/9/8/chartex" xmlns:cx2="http://schemas.microsoft.com/office/drawing/2015/10/21/chartex" xmlns:cx3="http://schemas.microsoft.com/office/drawing/2016/5/9/chartex" xmlns:cx4="http://schemas.microsoft.com/office/drawing/2016/5/10/chartex" xmlns:cx5="http://schemas.microsoft.com/office/drawing/2016/5/11/chartex" xmlns:cx6="http://schemas.microsoft.com/office/drawing/2016/5/12/chartex" xmlns:cx7="http://schemas.microsoft.com/office/drawing/2016/5/13/chartex" xmlns:cx8="http://schemas.microsoft.com/office/drawing/2016/5/14/chartex" xmlns:mc="http://schemas.openxmlformats.org/markup-compatibility/2006" xmlns:aink="http://schemas.microsoft.com/office/drawing/2016/ink" xmlns:am3d="http://schemas.microsoft.com/office/drawing/2017/model3d" xmlns:o="urn:schemas-microsoft-com:office:office" xmlns:oel="http://schemas.microsoft.com/office/2019/extlst" xmlns:r="http://schemas.openxmlformats.org/officeDocument/2006/relationships" xmlns:m="http://schemas.openxmlformats.org/officeDocument/2006/math" xmlns:v="urn:schemas-microsoft-com:vml" xmlns:wp14="http://schemas.microsoft.com/office/word/2010/wordprocessingDrawing" xmlns:wp="http://schemas.openxmlformats.org/drawingml/2006/wordprocessingDrawing" xmlns:w10="urn:schemas-microsoft-com:office:word" xmlns:w="http://schemas.openxmlformats.org/wordprocessingml/2006/main" xmlns:w14="http://schemas.microsoft.com/office/word/2010/wordml" xmlns:w15="http://schemas.microsoft.com/office/word/2012/wordml" xmlns:w16cex="http://schemas.microsoft.com/office/word/2018/wordml/cex" xmlns:w16cid="http://schemas.microsoft.com/office/word/2016/wordml/cid" xmlns:w16="http://schemas.microsoft.com/office/word/2018/wordml" xmlns:w16du="http://schemas.microsoft.com/office/word/2023/wordml/word16du" xmlns:w16sdtdh="http://schemas.microsoft.com/office/word/2020/wordml/sdtdatahash" xmlns:w16sdtfl="http://schemas.microsoft.com/office/word/2024/wordml/sdtformatlock" xmlns:w16se="http://schemas.microsoft.com/office/word/2015/wordml/symex" xmlns:wpg="http://schemas.microsoft.com/office/word/2010/wordprocessingGroup" xmlns:wpi="http://schemas.microsoft.com/office/word/2010/wordprocessingInk" xmlns:wne="http://schemas.microsoft.com/office/word/2006/wordml" xmlns:wps="http://schemas.microsoft.com/office/word/2010/wordprocessingShape" mc:Ignorable="w14 w15 w16se w16cid w16 w16cex w16sdtdh w16sdtfl w16du wp14">
+<w:document xmlns:o="urn:schemas-microsoft-com:office:office" xmlns:r="http://schemas.openxmlformats.org/officeDocument/2006/relationships" xmlns:v="urn:schemas-microsoft-com:vml" xmlns:w="http://schemas.openxmlformats.org/wordprocessingml/2006/main" xmlns:w10="urn:schemas-microsoft-com:office:word" xmlns:wp="http://schemas.openxmlformats.org/drawingml/2006/wordprocessingDrawing" xmlns:wps="http://schemas.microsoft.com/office/word/2010/wordprocessingShape" xmlns:wpg="http://schemas.microsoft.com/office/word/2010/wordprocessingGroup" xmlns:mc="http://schemas.openxmlformats.org/markup-compatibility/2006" xmlns:wp14="http://schemas.microsoft.com/office/word/2010/wordprocessingDrawing" xmlns:w14="http://schemas.microsoft.com/office/word/2010/wordml" xmlns:w15="http://schemas.microsoft.com/office/word/2012/wordml" mc:Ignorable="w14 wp14 w15">
   <w:background w:color="92D050"/>
   <w:body>
     <w:p>
       <w:pPr>
+        <w:pStyle w:val="Normal"/>
         <w:jc w:val="center"/>
         <w:rPr>
           <w:rFonts w:ascii="Arial" w:hAnsi="Arial" w:cs="Arial"/>
           <w:b/>
           <w:bCs/>
-          <w:color w:val="FFFFFF" w:themeColor="background1"/>
+          <w:color w:themeColor="background1" w:val="FFFFFF"/>
           <w:sz w:val="36"/>
           <w:szCs w:val="36"/>
           <w:u w:val="single"/>
@@ -18,10 +19,10 @@
       </w:pPr>
       <w:r>
         <w:rPr>
-          <w:rFonts w:ascii="Arial" w:hAnsi="Arial" w:cs="Arial"/>
+          <w:rFonts w:cs="Arial" w:ascii="Arial" w:hAnsi="Arial"/>
           <w:b/>
           <w:bCs/>
-          <w:color w:val="FFFFFF" w:themeColor="background1"/>
+          <w:color w:themeColor="background1" w:val="FFFFFF"/>
           <w:sz w:val="36"/>
           <w:szCs w:val="36"/>
           <w:u w:val="single"/>
@@ -31,27 +32,31 @@
     </w:p>
     <w:p>
       <w:pPr>
+        <w:pStyle w:val="Normal"/>
         <w:rPr>
           <w:rFonts w:ascii="Kanit Light" w:hAnsi="Kanit Light" w:cs="Kanit Light"/>
         </w:rPr>
       </w:pPr>
+      <w:r>
+        <w:rPr>
+          <w:rFonts w:cs="Kanit Light" w:ascii="Kanit Light" w:hAnsi="Kanit Light"/>
+        </w:rPr>
+      </w:r>
     </w:p>
     <w:p>
       <w:pPr>
+        <w:pStyle w:val="Normal"/>
         <w:rPr>
           <w:rFonts w:ascii="Kanit Light" w:hAnsi="Kanit Light" w:cs="Kanit Light"/>
         </w:rPr>
       </w:pPr>
       <w:r>
-        <w:rPr>
-          <w:rFonts w:ascii="Kanit Light" w:hAnsi="Kanit Light" w:cs="Kanit Light"/>
-          <w:noProof/>
-        </w:rPr>
+        <w:rPr/>
         <w:drawing>
-          <wp:inline distT="0" distB="0" distL="0" distR="0" wp14:anchorId="0B2B2D3C" wp14:editId="62F4086A">
+          <wp:inline distT="0" distB="0" distL="0" distR="0">
             <wp:extent cx="5731510" cy="1631315"/>
-            <wp:effectExtent l="0" t="0" r="2540" b="6985"/>
-            <wp:docPr id="1958466421" name="Picture 1"/>
+            <wp:effectExtent l="0" t="0" r="0" b="0"/>
+            <wp:docPr id="1" name="Picture 1" descr=""/>
             <wp:cNvGraphicFramePr>
               <a:graphicFrameLocks xmlns:a="http://schemas.openxmlformats.org/drawingml/2006/main" noChangeAspect="1"/>
             </wp:cNvGraphicFramePr>
@@ -59,20 +64,13 @@
               <a:graphicData uri="http://schemas.openxmlformats.org/drawingml/2006/picture">
                 <pic:pic xmlns:pic="http://schemas.openxmlformats.org/drawingml/2006/picture">
                   <pic:nvPicPr>
-                    <pic:cNvPr id="0" name="Picture 1"/>
+                    <pic:cNvPr id="1" name="Picture 1" descr=""/>
                     <pic:cNvPicPr>
                       <a:picLocks noChangeAspect="1" noChangeArrowheads="1"/>
                     </pic:cNvPicPr>
                   </pic:nvPicPr>
                   <pic:blipFill>
-                    <a:blip r:embed="rId4">
-                      <a:extLst>
-                        <a:ext uri="{28A0092B-C50C-407E-A947-70E740481C1C}">
-                          <a14:useLocalDpi xmlns:a14="http://schemas.microsoft.com/office/drawing/2010/main" val="0"/>
-                        </a:ext>
-                      </a:extLst>
-                    </a:blip>
-                    <a:srcRect/>
+                    <a:blip r:embed="rId2"/>
                     <a:stretch>
                       <a:fillRect/>
                     </a:stretch>
@@ -85,10 +83,6 @@
                     <a:prstGeom prst="rect">
                       <a:avLst/>
                     </a:prstGeom>
-                    <a:noFill/>
-                    <a:ln>
-                      <a:noFill/>
-                    </a:ln>
                   </pic:spPr>
                 </pic:pic>
               </a:graphicData>
@@ -99,11 +93,12 @@
     </w:p>
     <w:p>
       <w:pPr>
+        <w:pStyle w:val="Normal"/>
         <w:rPr>
           <w:rFonts w:ascii="Arial" w:hAnsi="Arial" w:cs="Arial"/>
           <w:b/>
           <w:bCs/>
-          <w:color w:val="FFFFFF" w:themeColor="background1"/>
+          <w:color w:themeColor="background1" w:val="FFFFFF"/>
           <w:sz w:val="28"/>
           <w:szCs w:val="28"/>
           <w:u w:val="single"/>
@@ -111,10 +106,10 @@
       </w:pPr>
       <w:r>
         <w:rPr>
-          <w:rFonts w:ascii="Arial" w:hAnsi="Arial" w:cs="Arial"/>
+          <w:rFonts w:cs="Arial" w:ascii="Arial" w:hAnsi="Arial"/>
           <w:b/>
           <w:bCs/>
-          <w:color w:val="FFFFFF" w:themeColor="background1"/>
+          <w:color w:themeColor="background1" w:val="FFFFFF"/>
           <w:sz w:val="28"/>
           <w:szCs w:val="28"/>
           <w:u w:val="single"/>
@@ -124,6 +119,7 @@
     </w:p>
     <w:p>
       <w:pPr>
+        <w:pStyle w:val="Normal"/>
         <w:rPr>
           <w:rFonts w:ascii="Kanit Light" w:hAnsi="Kanit Light" w:cs="Kanit Light"/>
           <w:b/>
@@ -131,15 +127,12 @@
         </w:rPr>
       </w:pPr>
       <w:r>
-        <w:rPr>
-          <w:rFonts w:ascii="Kanit Light" w:hAnsi="Kanit Light" w:cs="Kanit Light"/>
-          <w:noProof/>
-        </w:rPr>
+        <w:rPr/>
         <w:drawing>
-          <wp:inline distT="0" distB="0" distL="0" distR="0" wp14:anchorId="50A3657B" wp14:editId="3CDEE3CE">
-            <wp:extent cx="5223510" cy="2697405"/>
+          <wp:inline distT="0" distB="0" distL="0" distR="0">
+            <wp:extent cx="5223510" cy="2697480"/>
             <wp:effectExtent l="0" t="0" r="0" b="0"/>
-            <wp:docPr id="1899267454" name="Picture 2"/>
+            <wp:docPr id="2" name="Picture 2" descr=""/>
             <wp:cNvGraphicFramePr>
               <a:graphicFrameLocks xmlns:a="http://schemas.openxmlformats.org/drawingml/2006/main" noChangeAspect="1"/>
             </wp:cNvGraphicFramePr>
@@ -147,20 +140,13 @@
               <a:graphicData uri="http://schemas.openxmlformats.org/drawingml/2006/picture">
                 <pic:pic xmlns:pic="http://schemas.openxmlformats.org/drawingml/2006/picture">
                   <pic:nvPicPr>
-                    <pic:cNvPr id="0" name="Picture 3"/>
+                    <pic:cNvPr id="2" name="Picture 2" descr=""/>
                     <pic:cNvPicPr>
                       <a:picLocks noChangeAspect="1" noChangeArrowheads="1"/>
                     </pic:cNvPicPr>
                   </pic:nvPicPr>
                   <pic:blipFill>
-                    <a:blip r:embed="rId5" cstate="print">
-                      <a:extLst>
-                        <a:ext uri="{28A0092B-C50C-407E-A947-70E740481C1C}">
-                          <a14:useLocalDpi xmlns:a14="http://schemas.microsoft.com/office/drawing/2010/main" val="0"/>
-                        </a:ext>
-                      </a:extLst>
-                    </a:blip>
-                    <a:srcRect/>
+                    <a:blip r:embed="rId3"/>
                     <a:stretch>
                       <a:fillRect/>
                     </a:stretch>
@@ -168,15 +154,11 @@
                   <pic:spPr bwMode="auto">
                     <a:xfrm>
                       <a:off x="0" y="0"/>
-                      <a:ext cx="5228498" cy="2699981"/>
+                      <a:ext cx="5223510" cy="2697480"/>
                     </a:xfrm>
                     <a:prstGeom prst="rect">
                       <a:avLst/>
                     </a:prstGeom>
-                    <a:noFill/>
-                    <a:ln>
-                      <a:noFill/>
-                    </a:ln>
                   </pic:spPr>
                 </pic:pic>
               </a:graphicData>
@@ -187,6 +169,7 @@
     </w:p>
     <w:p>
       <w:pPr>
+        <w:pStyle w:val="Normal"/>
         <w:rPr>
           <w:rFonts w:ascii="Kanit Light" w:hAnsi="Kanit Light" w:cs="Kanit Light"/>
           <w:b/>
@@ -195,10 +178,10 @@
       </w:pPr>
       <w:r>
         <w:rPr>
-          <w:rFonts w:ascii="Arial" w:hAnsi="Arial" w:cs="Arial"/>
+          <w:rFonts w:cs="Arial" w:ascii="Arial" w:hAnsi="Arial"/>
           <w:b/>
           <w:bCs/>
-          <w:color w:val="FFFFFF" w:themeColor="background1"/>
+          <w:color w:themeColor="background1" w:val="FFFFFF"/>
           <w:sz w:val="28"/>
           <w:szCs w:val="28"/>
           <w:u w:val="single"/>
@@ -206,15 +189,12 @@
         <w:t>Saddles</w:t>
       </w:r>
       <w:r>
-        <w:rPr>
-          <w:rFonts w:ascii="Kanit Light" w:hAnsi="Kanit Light" w:cs="Kanit Light"/>
-          <w:noProof/>
-        </w:rPr>
+        <w:rPr/>
         <w:drawing>
-          <wp:inline distT="0" distB="0" distL="0" distR="0" wp14:anchorId="27D91E1D" wp14:editId="45A09773">
-            <wp:extent cx="5594350" cy="3123812"/>
+          <wp:inline distT="0" distB="0" distL="0" distR="0">
+            <wp:extent cx="5594350" cy="3123565"/>
             <wp:effectExtent l="0" t="0" r="0" b="0"/>
-            <wp:docPr id="614218559" name="Picture 3"/>
+            <wp:docPr id="3" name="Picture 3" descr=""/>
             <wp:cNvGraphicFramePr>
               <a:graphicFrameLocks xmlns:a="http://schemas.openxmlformats.org/drawingml/2006/main" noChangeAspect="1"/>
             </wp:cNvGraphicFramePr>
@@ -222,20 +202,13 @@
               <a:graphicData uri="http://schemas.openxmlformats.org/drawingml/2006/picture">
                 <pic:pic xmlns:pic="http://schemas.openxmlformats.org/drawingml/2006/picture">
                   <pic:nvPicPr>
-                    <pic:cNvPr id="0" name="Picture 5"/>
+                    <pic:cNvPr id="3" name="Picture 3" descr=""/>
                     <pic:cNvPicPr>
                       <a:picLocks noChangeAspect="1" noChangeArrowheads="1"/>
                     </pic:cNvPicPr>
                   </pic:nvPicPr>
                   <pic:blipFill>
-                    <a:blip r:embed="rId6" cstate="print">
-                      <a:extLst>
-                        <a:ext uri="{28A0092B-C50C-407E-A947-70E740481C1C}">
-                          <a14:useLocalDpi xmlns:a14="http://schemas.microsoft.com/office/drawing/2010/main" val="0"/>
-                        </a:ext>
-                      </a:extLst>
-                    </a:blip>
-                    <a:srcRect/>
+                    <a:blip r:embed="rId4"/>
                     <a:stretch>
                       <a:fillRect/>
                     </a:stretch>
@@ -243,15 +216,11 @@
                   <pic:spPr bwMode="auto">
                     <a:xfrm>
                       <a:off x="0" y="0"/>
-                      <a:ext cx="5594350" cy="3123812"/>
+                      <a:ext cx="5594350" cy="3123565"/>
                     </a:xfrm>
                     <a:prstGeom prst="rect">
                       <a:avLst/>
                     </a:prstGeom>
-                    <a:noFill/>
-                    <a:ln>
-                      <a:noFill/>
-                    </a:ln>
                   </pic:spPr>
                 </pic:pic>
               </a:graphicData>
@@ -262,20 +231,29 @@
     </w:p>
     <w:p>
       <w:pPr>
+        <w:pStyle w:val="Normal"/>
         <w:rPr>
           <w:rFonts w:ascii="Kanit Light" w:hAnsi="Kanit Light" w:cs="Kanit Light"/>
           <w:b/>
           <w:bCs/>
         </w:rPr>
       </w:pPr>
+      <w:r>
+        <w:rPr>
+          <w:rFonts w:cs="Kanit Light" w:ascii="Kanit Light" w:hAnsi="Kanit Light"/>
+          <w:b/>
+          <w:bCs/>
+        </w:rPr>
+      </w:r>
     </w:p>
     <w:p>
       <w:pPr>
+        <w:pStyle w:val="Normal"/>
         <w:rPr>
           <w:rFonts w:ascii="Arial" w:hAnsi="Arial" w:cs="Arial"/>
           <w:b/>
           <w:bCs/>
-          <w:color w:val="FFFFFF" w:themeColor="background1"/>
+          <w:color w:themeColor="background1" w:val="FFFFFF"/>
           <w:sz w:val="28"/>
           <w:szCs w:val="28"/>
           <w:u w:val="single"/>
@@ -283,10 +261,10 @@
       </w:pPr>
       <w:r>
         <w:rPr>
-          <w:rFonts w:ascii="Arial" w:hAnsi="Arial" w:cs="Arial"/>
+          <w:rFonts w:cs="Arial" w:ascii="Arial" w:hAnsi="Arial"/>
           <w:b/>
           <w:bCs/>
-          <w:color w:val="FFFFFF" w:themeColor="background1"/>
+          <w:color w:themeColor="background1" w:val="FFFFFF"/>
           <w:sz w:val="28"/>
           <w:szCs w:val="28"/>
           <w:u w:val="single"/>
@@ -296,20 +274,18 @@
     </w:p>
     <w:p>
       <w:pPr>
+        <w:pStyle w:val="Normal"/>
         <w:rPr>
           <w:rFonts w:ascii="Kanit Light" w:hAnsi="Kanit Light" w:cs="Kanit Light"/>
         </w:rPr>
       </w:pPr>
       <w:r>
-        <w:rPr>
-          <w:rFonts w:ascii="Kanit Light" w:hAnsi="Kanit Light" w:cs="Kanit Light"/>
-          <w:noProof/>
-        </w:rPr>
+        <w:rPr/>
         <w:drawing>
-          <wp:inline distT="0" distB="0" distL="0" distR="0" wp14:anchorId="1DD7F2EA" wp14:editId="0007C86C">
+          <wp:inline distT="0" distB="0" distL="0" distR="0">
             <wp:extent cx="5731510" cy="5306695"/>
             <wp:effectExtent l="0" t="0" r="0" b="0"/>
-            <wp:docPr id="777920973" name="Picture 5"/>
+            <wp:docPr id="4" name="Picture 5" descr=""/>
             <wp:cNvGraphicFramePr>
               <a:graphicFrameLocks xmlns:a="http://schemas.openxmlformats.org/drawingml/2006/main" noChangeAspect="1"/>
             </wp:cNvGraphicFramePr>
@@ -317,20 +293,13 @@
               <a:graphicData uri="http://schemas.openxmlformats.org/drawingml/2006/picture">
                 <pic:pic xmlns:pic="http://schemas.openxmlformats.org/drawingml/2006/picture">
                   <pic:nvPicPr>
-                    <pic:cNvPr id="0" name="Picture 9"/>
+                    <pic:cNvPr id="4" name="Picture 5" descr=""/>
                     <pic:cNvPicPr>
                       <a:picLocks noChangeAspect="1" noChangeArrowheads="1"/>
                     </pic:cNvPicPr>
                   </pic:nvPicPr>
                   <pic:blipFill>
-                    <a:blip r:embed="rId7" cstate="print">
-                      <a:extLst>
-                        <a:ext uri="{28A0092B-C50C-407E-A947-70E740481C1C}">
-                          <a14:useLocalDpi xmlns:a14="http://schemas.microsoft.com/office/drawing/2010/main" val="0"/>
-                        </a:ext>
-                      </a:extLst>
-                    </a:blip>
-                    <a:srcRect/>
+                    <a:blip r:embed="rId5"/>
                     <a:stretch>
                       <a:fillRect/>
                     </a:stretch>
@@ -343,10 +312,6 @@
                     <a:prstGeom prst="rect">
                       <a:avLst/>
                     </a:prstGeom>
-                    <a:noFill/>
-                    <a:ln>
-                      <a:noFill/>
-                    </a:ln>
                   </pic:spPr>
                 </pic:pic>
               </a:graphicData>
@@ -356,16 +321,16 @@
       </w:r>
       <w:r>
         <w:rPr>
-          <w:rFonts w:ascii="Kanit Light" w:hAnsi="Kanit Light" w:cs="Kanit Light"/>
+          <w:rFonts w:cs="Kanit Light" w:ascii="Kanit Light" w:hAnsi="Kanit Light"/>
         </w:rPr>
         <w:t xml:space="preserve"> </w:t>
       </w:r>
       <w:r>
         <w:rPr>
-          <w:rFonts w:ascii="Arial" w:hAnsi="Arial" w:cs="Arial"/>
+          <w:rFonts w:cs="Arial" w:ascii="Arial" w:hAnsi="Arial"/>
           <w:b/>
           <w:bCs/>
-          <w:color w:val="FFFFFF" w:themeColor="background1"/>
+          <w:color w:themeColor="background1" w:val="FFFFFF"/>
           <w:sz w:val="28"/>
           <w:szCs w:val="28"/>
           <w:u w:val="single"/>
@@ -375,21 +340,20 @@
     </w:p>
     <w:p>
       <w:pPr>
+        <w:pStyle w:val="Normal"/>
+        <w:spacing w:before="0" w:after="160"/>
         <w:jc w:val="center"/>
         <w:rPr>
           <w:rFonts w:ascii="Kanit Light" w:hAnsi="Kanit Light" w:cs="Kanit Light"/>
         </w:rPr>
       </w:pPr>
       <w:r>
-        <w:rPr>
-          <w:rFonts w:ascii="Kanit Light" w:hAnsi="Kanit Light" w:cs="Kanit Light"/>
-          <w:noProof/>
-        </w:rPr>
+        <w:rPr/>
         <w:drawing>
-          <wp:inline distT="0" distB="0" distL="0" distR="0" wp14:anchorId="29A9C3C5" wp14:editId="42E5AC17">
-            <wp:extent cx="3689350" cy="2629876"/>
-            <wp:effectExtent l="0" t="0" r="6350" b="0"/>
-            <wp:docPr id="1406970889" name="Picture 6"/>
+          <wp:inline distT="0" distB="0" distL="0" distR="0">
+            <wp:extent cx="3689350" cy="2629535"/>
+            <wp:effectExtent l="0" t="0" r="0" b="0"/>
+            <wp:docPr id="5" name="Picture 6" descr=""/>
             <wp:cNvGraphicFramePr>
               <a:graphicFrameLocks xmlns:a="http://schemas.openxmlformats.org/drawingml/2006/main" noChangeAspect="1"/>
             </wp:cNvGraphicFramePr>
@@ -397,20 +361,13 @@
               <a:graphicData uri="http://schemas.openxmlformats.org/drawingml/2006/picture">
                 <pic:pic xmlns:pic="http://schemas.openxmlformats.org/drawingml/2006/picture">
                   <pic:nvPicPr>
-                    <pic:cNvPr id="0" name="Picture 11"/>
+                    <pic:cNvPr id="5" name="Picture 6" descr=""/>
                     <pic:cNvPicPr>
                       <a:picLocks noChangeAspect="1" noChangeArrowheads="1"/>
                     </pic:cNvPicPr>
                   </pic:nvPicPr>
                   <pic:blipFill>
-                    <a:blip r:embed="rId8" cstate="print">
-                      <a:extLst>
-                        <a:ext uri="{28A0092B-C50C-407E-A947-70E740481C1C}">
-                          <a14:useLocalDpi xmlns:a14="http://schemas.microsoft.com/office/drawing/2010/main" val="0"/>
-                        </a:ext>
-                      </a:extLst>
-                    </a:blip>
-                    <a:srcRect/>
+                    <a:blip r:embed="rId6"/>
                     <a:stretch>
                       <a:fillRect/>
                     </a:stretch>
@@ -418,15 +375,11 @@
                   <pic:spPr bwMode="auto">
                     <a:xfrm>
                       <a:off x="0" y="0"/>
-                      <a:ext cx="3734197" cy="2661844"/>
+                      <a:ext cx="3689350" cy="2629535"/>
                     </a:xfrm>
                     <a:prstGeom prst="rect">
                       <a:avLst/>
                     </a:prstGeom>
-                    <a:noFill/>
-                    <a:ln>
-                      <a:noFill/>
-                    </a:ln>
                   </pic:spPr>
                 </pic:pic>
               </a:graphicData>
@@ -436,21 +389,86 @@
       </w:r>
     </w:p>
     <w:sectPr>
+      <w:headerReference w:type="default" r:id="rId7"/>
+      <w:type w:val="nextPage"/>
       <w:pgSz w:w="11906" w:h="16838"/>
-      <w:pgMar w:top="1440" w:right="1440" w:bottom="1440" w:left="1440" w:header="708" w:footer="708" w:gutter="0"/>
-      <w:cols w:space="708"/>
-      <w:docGrid w:linePitch="360"/>
+      <w:pgMar w:left="1440" w:right="1440" w:gutter="0" w:header="1440" w:top="2210" w:footer="0" w:bottom="1440"/>
+      <w:pgNumType w:fmt="decimal"/>
+      <w:formProt w:val="false"/>
+      <w:textDirection w:val="lrTb"/>
+      <w:docGrid w:type="default" w:linePitch="360" w:charSpace="0"/>
     </w:sectPr>
   </w:body>
 </w:document>
 </file>
 
+<file path=word/header1.xml><?xml version="1.0" encoding="utf-8"?>
+<w:hdr xmlns:o="urn:schemas-microsoft-com:office:office" xmlns:r="http://schemas.openxmlformats.org/officeDocument/2006/relationships" xmlns:v="urn:schemas-microsoft-com:vml" xmlns:w="http://schemas.openxmlformats.org/wordprocessingml/2006/main" xmlns:w10="urn:schemas-microsoft-com:office:word" xmlns:wp="http://schemas.openxmlformats.org/drawingml/2006/wordprocessingDrawing" xmlns:wps="http://schemas.microsoft.com/office/word/2010/wordprocessingShape" xmlns:wpg="http://schemas.microsoft.com/office/word/2010/wordprocessingGroup" xmlns:mc="http://schemas.openxmlformats.org/markup-compatibility/2006" xmlns:wp14="http://schemas.microsoft.com/office/word/2010/wordprocessingDrawing" xmlns:w14="http://schemas.microsoft.com/office/word/2010/wordml" xmlns:w15="http://schemas.microsoft.com/office/word/2012/wordml" mc:Ignorable="w14 wp14 w15">
+  <w:p>
+    <w:pPr>
+      <w:pStyle w:val="Header"/>
+      <w:suppressLineNumbers/>
+      <w:spacing w:before="0" w:after="160"/>
+      <w:rPr/>
+    </w:pPr>
+    <w:r>
+      <w:rPr/>
+      <w:drawing>
+        <wp:anchor behindDoc="1" distT="0" distB="0" distL="0" distR="0" simplePos="0" locked="0" layoutInCell="0" allowOverlap="1" relativeHeight="7">
+          <wp:simplePos x="0" y="0"/>
+          <wp:positionH relativeFrom="column">
+            <wp:posOffset>4161155</wp:posOffset>
+          </wp:positionH>
+          <wp:positionV relativeFrom="paragraph">
+            <wp:posOffset>-409575</wp:posOffset>
+          </wp:positionV>
+          <wp:extent cx="1769745" cy="363220"/>
+          <wp:effectExtent l="0" t="0" r="0" b="0"/>
+          <wp:wrapSquare wrapText="largest"/>
+          <wp:docPr id="6" name="Image1" descr=""/>
+          <wp:cNvGraphicFramePr>
+            <a:graphicFrameLocks xmlns:a="http://schemas.openxmlformats.org/drawingml/2006/main" noChangeAspect="1"/>
+          </wp:cNvGraphicFramePr>
+          <a:graphic xmlns:a="http://schemas.openxmlformats.org/drawingml/2006/main">
+            <a:graphicData uri="http://schemas.openxmlformats.org/drawingml/2006/picture">
+              <pic:pic xmlns:pic="http://schemas.openxmlformats.org/drawingml/2006/picture">
+                <pic:nvPicPr>
+                  <pic:cNvPr id="6" name="Image1" descr=""/>
+                  <pic:cNvPicPr>
+                    <a:picLocks noChangeAspect="1" noChangeArrowheads="1"/>
+                  </pic:cNvPicPr>
+                </pic:nvPicPr>
+                <pic:blipFill>
+                  <a:blip r:embed="rId1"/>
+                  <a:stretch>
+                    <a:fillRect/>
+                  </a:stretch>
+                </pic:blipFill>
+                <pic:spPr bwMode="auto">
+                  <a:xfrm>
+                    <a:off x="0" y="0"/>
+                    <a:ext cx="1769745" cy="363220"/>
+                  </a:xfrm>
+                  <a:prstGeom prst="rect">
+                    <a:avLst/>
+                  </a:prstGeom>
+                </pic:spPr>
+              </pic:pic>
+            </a:graphicData>
+          </a:graphic>
+        </wp:anchor>
+      </w:drawing>
+    </w:r>
+  </w:p>
+</w:hdr>
+</file>
+
 <file path=word/styles.xml><?xml version="1.0" encoding="utf-8"?>
-<w:styles xmlns:mc="http://schemas.openxmlformats.org/markup-compatibility/2006" xmlns:r="http://schemas.openxmlformats.org/officeDocument/2006/relationships" xmlns:w="http://schemas.openxmlformats.org/wordprocessingml/2006/main" xmlns:w14="http://schemas.microsoft.com/office/word/2010/wordml" xmlns:w15="http://schemas.microsoft.com/office/word/2012/wordml" xmlns:w16cex="http://schemas.microsoft.com/office/word/2018/wordml/cex" xmlns:w16cid="http://schemas.microsoft.com/office/word/2016/wordml/cid" xmlns:w16="http://schemas.microsoft.com/office/word/2018/wordml" xmlns:w16du="http://schemas.microsoft.com/office/word/2023/wordml/word16du" xmlns:w16sdtdh="http://schemas.microsoft.com/office/word/2020/wordml/sdtdatahash" xmlns:w16sdtfl="http://schemas.microsoft.com/office/word/2024/wordml/sdtformatlock" xmlns:w16se="http://schemas.microsoft.com/office/word/2015/wordml/symex" mc:Ignorable="w14 w15 w16se w16cid w16 w16cex w16sdtdh w16sdtfl w16du">
+<w:styles xmlns:w="http://schemas.openxmlformats.org/wordprocessingml/2006/main" xmlns:w14="http://schemas.microsoft.com/office/word/2010/wordml" xmlns:mc="http://schemas.openxmlformats.org/markup-compatibility/2006" mc:Ignorable="w14">
   <w:docDefaults>
     <w:rPrDefault>
       <w:rPr>
-        <w:rFonts w:asciiTheme="minorHAnsi" w:eastAsiaTheme="minorHAnsi" w:hAnsiTheme="minorHAnsi" w:cstheme="minorBidi"/>
+        <w:rFonts w:ascii="Aptos" w:hAnsi="Aptos" w:eastAsia="Aptos" w:cs="Cordia New" w:asciiTheme="minorHAnsi" w:cstheme="minorBidi" w:eastAsiaTheme="minorHAnsi" w:hAnsiTheme="minorHAnsi"/>
         <w:kern w:val="2"/>
         <w:sz w:val="24"/>
         <w:szCs w:val="30"/>
@@ -460,21 +478,21 @@
     </w:rPrDefault>
     <w:pPrDefault>
       <w:pPr>
-        <w:spacing w:after="160"/>
+        <w:suppressAutoHyphens w:val="true"/>
       </w:pPr>
     </w:pPrDefault>
   </w:docDefaults>
   <w:latentStyles w:defLockedState="0" w:defUIPriority="99" w:defSemiHidden="0" w:defUnhideWhenUsed="0" w:defQFormat="0" w:count="376">
     <w:lsdException w:name="Normal" w:uiPriority="0" w:qFormat="1"/>
     <w:lsdException w:name="heading 1" w:uiPriority="9" w:qFormat="1"/>
-    <w:lsdException w:name="heading 2" w:semiHidden="1" w:uiPriority="9" w:unhideWhenUsed="1" w:qFormat="1"/>
-    <w:lsdException w:name="heading 3" w:semiHidden="1" w:uiPriority="9" w:unhideWhenUsed="1" w:qFormat="1"/>
-    <w:lsdException w:name="heading 4" w:semiHidden="1" w:uiPriority="9" w:unhideWhenUsed="1" w:qFormat="1"/>
-    <w:lsdException w:name="heading 5" w:semiHidden="1" w:uiPriority="9" w:unhideWhenUsed="1" w:qFormat="1"/>
-    <w:lsdException w:name="heading 6" w:semiHidden="1" w:uiPriority="9" w:unhideWhenUsed="1" w:qFormat="1"/>
-    <w:lsdException w:name="heading 7" w:semiHidden="1" w:uiPriority="9" w:unhideWhenUsed="1" w:qFormat="1"/>
-    <w:lsdException w:name="heading 8" w:semiHidden="1" w:uiPriority="9" w:unhideWhenUsed="1" w:qFormat="1"/>
-    <w:lsdException w:name="heading 9" w:semiHidden="1" w:uiPriority="9" w:unhideWhenUsed="1" w:qFormat="1"/>
+    <w:lsdException w:name="heading 2" w:uiPriority="9" w:semiHidden="1" w:unhideWhenUsed="1" w:qFormat="1"/>
+    <w:lsdException w:name="heading 3" w:uiPriority="9" w:semiHidden="1" w:unhideWhenUsed="1" w:qFormat="1"/>
+    <w:lsdException w:name="heading 4" w:uiPriority="9" w:semiHidden="1" w:unhideWhenUsed="1" w:qFormat="1"/>
+    <w:lsdException w:name="heading 5" w:uiPriority="9" w:semiHidden="1" w:unhideWhenUsed="1" w:qFormat="1"/>
+    <w:lsdException w:name="heading 6" w:uiPriority="9" w:semiHidden="1" w:unhideWhenUsed="1" w:qFormat="1"/>
+    <w:lsdException w:name="heading 7" w:uiPriority="9" w:semiHidden="1" w:unhideWhenUsed="1" w:qFormat="1"/>
+    <w:lsdException w:name="heading 8" w:uiPriority="9" w:semiHidden="1" w:unhideWhenUsed="1" w:qFormat="1"/>
+    <w:lsdException w:name="heading 9" w:uiPriority="9" w:semiHidden="1" w:unhideWhenUsed="1" w:qFormat="1"/>
     <w:lsdException w:name="index 1" w:semiHidden="1" w:unhideWhenUsed="1"/>
     <w:lsdException w:name="index 2" w:semiHidden="1" w:unhideWhenUsed="1"/>
     <w:lsdException w:name="index 3" w:semiHidden="1" w:unhideWhenUsed="1"/>
@@ -484,22 +502,22 @@
     <w:lsdException w:name="index 7" w:semiHidden="1" w:unhideWhenUsed="1"/>
     <w:lsdException w:name="index 8" w:semiHidden="1" w:unhideWhenUsed="1"/>
     <w:lsdException w:name="index 9" w:semiHidden="1" w:unhideWhenUsed="1"/>
-    <w:lsdException w:name="toc 1" w:semiHidden="1" w:uiPriority="39" w:unhideWhenUsed="1"/>
-    <w:lsdException w:name="toc 2" w:semiHidden="1" w:uiPriority="39" w:unhideWhenUsed="1"/>
-    <w:lsdException w:name="toc 3" w:semiHidden="1" w:uiPriority="39" w:unhideWhenUsed="1"/>
-    <w:lsdException w:name="toc 4" w:semiHidden="1" w:uiPriority="39" w:unhideWhenUsed="1"/>
-    <w:lsdException w:name="toc 5" w:semiHidden="1" w:uiPriority="39" w:unhideWhenUsed="1"/>
-    <w:lsdException w:name="toc 6" w:semiHidden="1" w:uiPriority="39" w:unhideWhenUsed="1"/>
-    <w:lsdException w:name="toc 7" w:semiHidden="1" w:uiPriority="39" w:unhideWhenUsed="1"/>
-    <w:lsdException w:name="toc 8" w:semiHidden="1" w:uiPriority="39" w:unhideWhenUsed="1"/>
-    <w:lsdException w:name="toc 9" w:semiHidden="1" w:uiPriority="39" w:unhideWhenUsed="1"/>
+    <w:lsdException w:name="toc 1" w:uiPriority="39" w:semiHidden="1" w:unhideWhenUsed="1"/>
+    <w:lsdException w:name="toc 2" w:uiPriority="39" w:semiHidden="1" w:unhideWhenUsed="1"/>
+    <w:lsdException w:name="toc 3" w:uiPriority="39" w:semiHidden="1" w:unhideWhenUsed="1"/>
+    <w:lsdException w:name="toc 4" w:uiPriority="39" w:semiHidden="1" w:unhideWhenUsed="1"/>
+    <w:lsdException w:name="toc 5" w:uiPriority="39" w:semiHidden="1" w:unhideWhenUsed="1"/>
+    <w:lsdException w:name="toc 6" w:uiPriority="39" w:semiHidden="1" w:unhideWhenUsed="1"/>
+    <w:lsdException w:name="toc 7" w:uiPriority="39" w:semiHidden="1" w:unhideWhenUsed="1"/>
+    <w:lsdException w:name="toc 8" w:uiPriority="39" w:semiHidden="1" w:unhideWhenUsed="1"/>
+    <w:lsdException w:name="toc 9" w:uiPriority="39" w:semiHidden="1" w:unhideWhenUsed="1"/>
     <w:lsdException w:name="Normal Indent" w:semiHidden="1" w:unhideWhenUsed="1"/>
     <w:lsdException w:name="footnote text" w:semiHidden="1" w:unhideWhenUsed="1"/>
     <w:lsdException w:name="annotation text" w:semiHidden="1" w:unhideWhenUsed="1"/>
     <w:lsdException w:name="header" w:semiHidden="1" w:unhideWhenUsed="1"/>
     <w:lsdException w:name="footer" w:semiHidden="1" w:unhideWhenUsed="1"/>
     <w:lsdException w:name="index heading" w:semiHidden="1" w:unhideWhenUsed="1"/>
-    <w:lsdException w:name="caption" w:semiHidden="1" w:uiPriority="35" w:unhideWhenUsed="1" w:qFormat="1"/>
+    <w:lsdException w:name="caption" w:uiPriority="35" w:semiHidden="1" w:unhideWhenUsed="1" w:qFormat="1"/>
     <w:lsdException w:name="table of figures" w:semiHidden="1" w:unhideWhenUsed="1"/>
     <w:lsdException w:name="envelope address" w:semiHidden="1" w:unhideWhenUsed="1"/>
     <w:lsdException w:name="envelope return" w:semiHidden="1" w:unhideWhenUsed="1"/>
@@ -530,7 +548,7 @@
     <w:lsdException w:name="Title" w:uiPriority="10" w:qFormat="1"/>
     <w:lsdException w:name="Closing" w:semiHidden="1" w:unhideWhenUsed="1"/>
     <w:lsdException w:name="Signature" w:semiHidden="1" w:unhideWhenUsed="1"/>
-    <w:lsdException w:name="Default Paragraph Font" w:semiHidden="1" w:uiPriority="1" w:unhideWhenUsed="1"/>
+    <w:lsdException w:name="Default Paragraph Font" w:uiPriority="1" w:semiHidden="1" w:unhideWhenUsed="1"/>
     <w:lsdException w:name="Body Text" w:semiHidden="1" w:unhideWhenUsed="1"/>
     <w:lsdException w:name="Body Text Indent" w:semiHidden="1" w:unhideWhenUsed="1"/>
     <w:lsdException w:name="List Continue" w:semiHidden="1" w:unhideWhenUsed="1"/>
@@ -730,8 +748,8 @@
     <w:lsdException w:name="Subtle Reference" w:uiPriority="31" w:qFormat="1"/>
     <w:lsdException w:name="Intense Reference" w:uiPriority="32" w:qFormat="1"/>
     <w:lsdException w:name="Book Title" w:uiPriority="33" w:qFormat="1"/>
-    <w:lsdException w:name="Bibliography" w:semiHidden="1" w:uiPriority="37" w:unhideWhenUsed="1"/>
-    <w:lsdException w:name="TOC Heading" w:semiHidden="1" w:uiPriority="39" w:unhideWhenUsed="1" w:qFormat="1"/>
+    <w:lsdException w:name="Bibliography" w:uiPriority="37" w:semiHidden="1" w:unhideWhenUsed="1"/>
+    <w:lsdException w:name="TOC Heading" w:uiPriority="39" w:semiHidden="1" w:unhideWhenUsed="1" w:qFormat="1"/>
     <w:lsdException w:name="Plain Table 1" w:uiPriority="41"/>
     <w:lsdException w:name="Plain Table 2" w:uiPriority="42"/>
     <w:lsdException w:name="Plain Table 3" w:uiPriority="43"/>
@@ -842,33 +860,48 @@
     <w:lsdException w:name="Unresolved Mention" w:semiHidden="1" w:unhideWhenUsed="1"/>
     <w:lsdException w:name="Smart Link" w:semiHidden="1" w:unhideWhenUsed="1"/>
   </w:latentStyles>
-  <w:style w:type="paragraph" w:default="1" w:styleId="Normal">
+  <w:style w:type="paragraph" w:styleId="Normal" w:default="1">
     <w:name w:val="Normal"/>
     <w:qFormat/>
+    <w:pPr>
+      <w:widowControl/>
+      <w:bidi w:val="0"/>
+      <w:spacing w:before="0" w:after="160"/>
+      <w:jc w:val="left"/>
+    </w:pPr>
+    <w:rPr>
+      <w:rFonts w:ascii="Aptos" w:hAnsi="Aptos" w:eastAsia="Aptos" w:cs="Cordia New" w:asciiTheme="minorHAnsi" w:cstheme="minorBidi" w:eastAsiaTheme="minorHAnsi" w:hAnsiTheme="minorHAnsi"/>
+      <w:color w:val="auto"/>
+      <w:kern w:val="2"/>
+      <w:sz w:val="24"/>
+      <w:szCs w:val="30"/>
+      <w:lang w:val="en-US" w:eastAsia="en-US" w:bidi="th-TH"/>
+      <w14:ligatures w14:val="standardContextual"/>
+    </w:rPr>
   </w:style>
   <w:style w:type="paragraph" w:styleId="Heading1">
-    <w:name w:val="heading 1"/>
+    <w:name w:val="Heading 1"/>
     <w:basedOn w:val="Normal"/>
     <w:next w:val="Normal"/>
     <w:link w:val="Heading1Char"/>
     <w:uiPriority w:val="9"/>
     <w:qFormat/>
-    <w:rsid w:val="005901B8"/>
-    <w:pPr>
-      <w:keepNext/>
+    <w:rsid w:val="005901b8"/>
+    <w:pPr>
+      <w:keepNext w:val="true"/>
       <w:keepLines/>
       <w:spacing w:before="320" w:after="40"/>
       <w:outlineLvl w:val="0"/>
     </w:pPr>
     <w:rPr>
-      <w:rFonts w:asciiTheme="majorHAnsi" w:eastAsiaTheme="majorEastAsia" w:hAnsiTheme="majorHAnsi" w:cstheme="majorBidi"/>
-      <w:color w:val="0F4761" w:themeColor="accent1" w:themeShade="BF"/>
+      <w:rFonts w:ascii="Aptos Display" w:hAnsi="Aptos Display" w:eastAsia="" w:cs="Angsana New" w:asciiTheme="majorHAnsi" w:cstheme="majorBidi" w:eastAsiaTheme="majorEastAsia" w:hAnsiTheme="majorHAnsi"/>
+      <w:color w:themeColor="accent1" w:themeShade="bf" w:val="0F4761"/>
       <w:sz w:val="40"/>
       <w:szCs w:val="50"/>
     </w:rPr>
   </w:style>
   <w:style w:type="paragraph" w:styleId="Heading2">
-    <w:name w:val="heading 2"/>
+    <w:name w:val="Heading 2"/>
     <w:basedOn w:val="Normal"/>
     <w:next w:val="Normal"/>
     <w:link w:val="Heading2Char"/>
@@ -876,44 +909,44 @@
     <w:semiHidden/>
     <w:unhideWhenUsed/>
     <w:qFormat/>
-    <w:rsid w:val="005901B8"/>
-    <w:pPr>
-      <w:keepNext/>
+    <w:rsid w:val="005901b8"/>
+    <w:pPr>
+      <w:keepNext w:val="true"/>
       <w:keepLines/>
       <w:spacing w:before="120" w:after="40"/>
       <w:outlineLvl w:val="1"/>
     </w:pPr>
     <w:rPr>
-      <w:rFonts w:asciiTheme="majorHAnsi" w:eastAsiaTheme="majorEastAsia" w:hAnsiTheme="majorHAnsi" w:cstheme="majorBidi"/>
-      <w:color w:val="0F4761" w:themeColor="accent1" w:themeShade="BF"/>
+      <w:rFonts w:ascii="Aptos Display" w:hAnsi="Aptos Display" w:eastAsia="" w:cs="Angsana New" w:asciiTheme="majorHAnsi" w:cstheme="majorBidi" w:eastAsiaTheme="majorEastAsia" w:hAnsiTheme="majorHAnsi"/>
+      <w:color w:themeColor="accent1" w:themeShade="bf" w:val="0F4761"/>
       <w:sz w:val="32"/>
       <w:szCs w:val="40"/>
     </w:rPr>
   </w:style>
   <w:style w:type="paragraph" w:styleId="Heading3">
-    <w:name w:val="heading 3"/>
+    <w:name w:val="Heading 3"/>
     <w:basedOn w:val="Normal"/>
     <w:next w:val="Normal"/>
     <w:link w:val="Heading3Char"/>
     <w:uiPriority w:val="9"/>
     <w:unhideWhenUsed/>
     <w:qFormat/>
-    <w:rsid w:val="005901B8"/>
-    <w:pPr>
-      <w:keepNext/>
+    <w:rsid w:val="005901b8"/>
+    <w:pPr>
+      <w:keepNext w:val="true"/>
       <w:keepLines/>
       <w:spacing w:before="120" w:after="40"/>
       <w:outlineLvl w:val="2"/>
     </w:pPr>
     <w:rPr>
-      <w:rFonts w:eastAsiaTheme="majorEastAsia" w:cstheme="majorBidi"/>
-      <w:color w:val="0F4761" w:themeColor="accent1" w:themeShade="BF"/>
+      <w:rFonts w:eastAsia="" w:cs="Angsana New" w:cstheme="majorBidi" w:eastAsiaTheme="majorEastAsia"/>
+      <w:color w:themeColor="accent1" w:themeShade="bf" w:val="0F4761"/>
       <w:sz w:val="28"/>
       <w:szCs w:val="35"/>
     </w:rPr>
   </w:style>
   <w:style w:type="paragraph" w:styleId="Heading4">
-    <w:name w:val="heading 4"/>
+    <w:name w:val="Heading 4"/>
     <w:basedOn w:val="Normal"/>
     <w:next w:val="Normal"/>
     <w:link w:val="Heading4Char"/>
@@ -921,22 +954,22 @@
     <w:semiHidden/>
     <w:unhideWhenUsed/>
     <w:qFormat/>
-    <w:rsid w:val="005901B8"/>
-    <w:pPr>
-      <w:keepNext/>
+    <w:rsid w:val="005901b8"/>
+    <w:pPr>
+      <w:keepNext w:val="true"/>
       <w:keepLines/>
       <w:spacing w:before="80" w:after="40"/>
       <w:outlineLvl w:val="3"/>
     </w:pPr>
     <w:rPr>
-      <w:rFonts w:eastAsiaTheme="majorEastAsia" w:cstheme="majorBidi"/>
+      <w:rFonts w:eastAsia="" w:cs="Angsana New" w:cstheme="majorBidi" w:eastAsiaTheme="majorEastAsia"/>
       <w:i/>
       <w:iCs/>
-      <w:color w:val="0F4761" w:themeColor="accent1" w:themeShade="BF"/>
+      <w:color w:themeColor="accent1" w:themeShade="bf" w:val="0F4761"/>
     </w:rPr>
   </w:style>
   <w:style w:type="paragraph" w:styleId="Heading5">
-    <w:name w:val="heading 5"/>
+    <w:name w:val="Heading 5"/>
     <w:basedOn w:val="Normal"/>
     <w:next w:val="Normal"/>
     <w:link w:val="Heading5Char"/>
@@ -944,20 +977,20 @@
     <w:semiHidden/>
     <w:unhideWhenUsed/>
     <w:qFormat/>
-    <w:rsid w:val="005901B8"/>
-    <w:pPr>
-      <w:keepNext/>
+    <w:rsid w:val="005901b8"/>
+    <w:pPr>
+      <w:keepNext w:val="true"/>
       <w:keepLines/>
       <w:spacing w:before="80" w:after="40"/>
       <w:outlineLvl w:val="4"/>
     </w:pPr>
     <w:rPr>
-      <w:rFonts w:eastAsiaTheme="majorEastAsia" w:cstheme="majorBidi"/>
-      <w:color w:val="0F4761" w:themeColor="accent1" w:themeShade="BF"/>
+      <w:rFonts w:eastAsia="" w:cs="Angsana New" w:cstheme="majorBidi" w:eastAsiaTheme="majorEastAsia"/>
+      <w:color w:themeColor="accent1" w:themeShade="bf" w:val="0F4761"/>
     </w:rPr>
   </w:style>
   <w:style w:type="paragraph" w:styleId="Heading6">
-    <w:name w:val="heading 6"/>
+    <w:name w:val="Heading 6"/>
     <w:basedOn w:val="Normal"/>
     <w:next w:val="Normal"/>
     <w:link w:val="Heading6Char"/>
@@ -965,22 +998,22 @@
     <w:semiHidden/>
     <w:unhideWhenUsed/>
     <w:qFormat/>
-    <w:rsid w:val="005901B8"/>
-    <w:pPr>
-      <w:keepNext/>
+    <w:rsid w:val="005901b8"/>
+    <w:pPr>
+      <w:keepNext w:val="true"/>
       <w:keepLines/>
       <w:spacing w:before="40" w:after="0"/>
       <w:outlineLvl w:val="5"/>
     </w:pPr>
     <w:rPr>
-      <w:rFonts w:eastAsiaTheme="majorEastAsia" w:cstheme="majorBidi"/>
+      <w:rFonts w:eastAsia="" w:cs="Angsana New" w:cstheme="majorBidi" w:eastAsiaTheme="majorEastAsia"/>
       <w:i/>
       <w:iCs/>
-      <w:color w:val="595959" w:themeColor="text1" w:themeTint="A6"/>
+      <w:color w:themeColor="text1" w:themeTint="a6" w:val="595959"/>
     </w:rPr>
   </w:style>
   <w:style w:type="paragraph" w:styleId="Heading7">
-    <w:name w:val="heading 7"/>
+    <w:name w:val="Heading 7"/>
     <w:basedOn w:val="Normal"/>
     <w:next w:val="Normal"/>
     <w:link w:val="Heading7Char"/>
@@ -988,20 +1021,20 @@
     <w:semiHidden/>
     <w:unhideWhenUsed/>
     <w:qFormat/>
-    <w:rsid w:val="005901B8"/>
-    <w:pPr>
-      <w:keepNext/>
+    <w:rsid w:val="005901b8"/>
+    <w:pPr>
+      <w:keepNext w:val="true"/>
       <w:keepLines/>
       <w:spacing w:before="40" w:after="0"/>
       <w:outlineLvl w:val="6"/>
     </w:pPr>
     <w:rPr>
-      <w:rFonts w:eastAsiaTheme="majorEastAsia" w:cstheme="majorBidi"/>
-      <w:color w:val="595959" w:themeColor="text1" w:themeTint="A6"/>
+      <w:rFonts w:eastAsia="" w:cs="Angsana New" w:cstheme="majorBidi" w:eastAsiaTheme="majorEastAsia"/>
+      <w:color w:themeColor="text1" w:themeTint="a6" w:val="595959"/>
     </w:rPr>
   </w:style>
   <w:style w:type="paragraph" w:styleId="Heading8">
-    <w:name w:val="heading 8"/>
+    <w:name w:val="Heading 8"/>
     <w:basedOn w:val="Normal"/>
     <w:next w:val="Normal"/>
     <w:link w:val="Heading8Char"/>
@@ -1009,22 +1042,22 @@
     <w:semiHidden/>
     <w:unhideWhenUsed/>
     <w:qFormat/>
-    <w:rsid w:val="005901B8"/>
-    <w:pPr>
-      <w:keepNext/>
+    <w:rsid w:val="005901b8"/>
+    <w:pPr>
+      <w:keepNext w:val="true"/>
       <w:keepLines/>
-      <w:spacing w:after="0"/>
+      <w:spacing w:before="0" w:after="0"/>
       <w:outlineLvl w:val="7"/>
     </w:pPr>
     <w:rPr>
-      <w:rFonts w:eastAsiaTheme="majorEastAsia" w:cstheme="majorBidi"/>
+      <w:rFonts w:eastAsia="" w:cs="Angsana New" w:cstheme="majorBidi" w:eastAsiaTheme="majorEastAsia"/>
       <w:i/>
       <w:iCs/>
-      <w:color w:val="272727" w:themeColor="text1" w:themeTint="D8"/>
+      <w:color w:themeColor="text1" w:themeTint="d8" w:val="272727"/>
     </w:rPr>
   </w:style>
   <w:style w:type="paragraph" w:styleId="Heading9">
-    <w:name w:val="heading 9"/>
+    <w:name w:val="Heading 9"/>
     <w:basedOn w:val="Normal"/>
     <w:next w:val="Normal"/>
     <w:link w:val="Heading9Char"/>
@@ -1032,23 +1065,412 @@
     <w:semiHidden/>
     <w:unhideWhenUsed/>
     <w:qFormat/>
-    <w:rsid w:val="005901B8"/>
-    <w:pPr>
-      <w:keepNext/>
+    <w:rsid w:val="005901b8"/>
+    <w:pPr>
+      <w:keepNext w:val="true"/>
       <w:keepLines/>
-      <w:spacing w:after="0"/>
+      <w:spacing w:before="0" w:after="0"/>
       <w:outlineLvl w:val="8"/>
     </w:pPr>
     <w:rPr>
-      <w:rFonts w:eastAsiaTheme="majorEastAsia" w:cstheme="majorBidi"/>
-      <w:color w:val="272727" w:themeColor="text1" w:themeTint="D8"/>
-    </w:rPr>
-  </w:style>
-  <w:style w:type="character" w:default="1" w:styleId="DefaultParagraphFont">
+      <w:rFonts w:eastAsia="" w:cs="Angsana New" w:cstheme="majorBidi" w:eastAsiaTheme="majorEastAsia"/>
+      <w:color w:themeColor="text1" w:themeTint="d8" w:val="272727"/>
+    </w:rPr>
+  </w:style>
+  <w:style w:type="character" w:styleId="DefaultParagraphFont" w:default="1">
     <w:name w:val="Default Paragraph Font"/>
     <w:uiPriority w:val="1"/>
     <w:semiHidden/>
     <w:unhideWhenUsed/>
+    <w:qFormat/>
+    <w:rPr/>
+  </w:style>
+  <w:style w:type="character" w:styleId="Heading1Char" w:customStyle="1">
+    <w:name w:val="Heading 1 Char"/>
+    <w:basedOn w:val="DefaultParagraphFont"/>
+    <w:link w:val="Heading1"/>
+    <w:uiPriority w:val="9"/>
+    <w:qFormat/>
+    <w:rsid w:val="005901b8"/>
+    <w:rPr>
+      <w:rFonts w:ascii="Aptos Display" w:hAnsi="Aptos Display" w:eastAsia="" w:cs="Angsana New" w:asciiTheme="majorHAnsi" w:cstheme="majorBidi" w:eastAsiaTheme="majorEastAsia" w:hAnsiTheme="majorHAnsi"/>
+      <w:color w:themeColor="accent1" w:themeShade="bf" w:val="0F4761"/>
+      <w:sz w:val="40"/>
+      <w:szCs w:val="50"/>
+    </w:rPr>
+  </w:style>
+  <w:style w:type="character" w:styleId="Heading2Char" w:customStyle="1">
+    <w:name w:val="Heading 2 Char"/>
+    <w:basedOn w:val="DefaultParagraphFont"/>
+    <w:link w:val="Heading2"/>
+    <w:uiPriority w:val="9"/>
+    <w:semiHidden/>
+    <w:qFormat/>
+    <w:rsid w:val="005901b8"/>
+    <w:rPr>
+      <w:rFonts w:ascii="Aptos Display" w:hAnsi="Aptos Display" w:eastAsia="" w:cs="Angsana New" w:asciiTheme="majorHAnsi" w:cstheme="majorBidi" w:eastAsiaTheme="majorEastAsia" w:hAnsiTheme="majorHAnsi"/>
+      <w:color w:themeColor="accent1" w:themeShade="bf" w:val="0F4761"/>
+      <w:sz w:val="32"/>
+      <w:szCs w:val="40"/>
+    </w:rPr>
+  </w:style>
+  <w:style w:type="character" w:styleId="Heading3Char" w:customStyle="1">
+    <w:name w:val="Heading 3 Char"/>
+    <w:basedOn w:val="DefaultParagraphFont"/>
+    <w:link w:val="Heading3"/>
+    <w:uiPriority w:val="9"/>
+    <w:qFormat/>
+    <w:rsid w:val="005901b8"/>
+    <w:rPr>
+      <w:rFonts w:eastAsia="" w:cs="Angsana New" w:cstheme="majorBidi" w:eastAsiaTheme="majorEastAsia"/>
+      <w:color w:themeColor="accent1" w:themeShade="bf" w:val="0F4761"/>
+      <w:sz w:val="28"/>
+      <w:szCs w:val="35"/>
+    </w:rPr>
+  </w:style>
+  <w:style w:type="character" w:styleId="Heading4Char" w:customStyle="1">
+    <w:name w:val="Heading 4 Char"/>
+    <w:basedOn w:val="DefaultParagraphFont"/>
+    <w:link w:val="Heading4"/>
+    <w:uiPriority w:val="9"/>
+    <w:semiHidden/>
+    <w:qFormat/>
+    <w:rsid w:val="005901b8"/>
+    <w:rPr>
+      <w:rFonts w:eastAsia="" w:cs="Angsana New" w:cstheme="majorBidi" w:eastAsiaTheme="majorEastAsia"/>
+      <w:i/>
+      <w:iCs/>
+      <w:color w:themeColor="accent1" w:themeShade="bf" w:val="0F4761"/>
+    </w:rPr>
+  </w:style>
+  <w:style w:type="character" w:styleId="Heading5Char" w:customStyle="1">
+    <w:name w:val="Heading 5 Char"/>
+    <w:basedOn w:val="DefaultParagraphFont"/>
+    <w:link w:val="Heading5"/>
+    <w:uiPriority w:val="9"/>
+    <w:semiHidden/>
+    <w:qFormat/>
+    <w:rsid w:val="005901b8"/>
+    <w:rPr>
+      <w:rFonts w:eastAsia="" w:cs="Angsana New" w:cstheme="majorBidi" w:eastAsiaTheme="majorEastAsia"/>
+      <w:color w:themeColor="accent1" w:themeShade="bf" w:val="0F4761"/>
+    </w:rPr>
+  </w:style>
+  <w:style w:type="character" w:styleId="Heading6Char" w:customStyle="1">
+    <w:name w:val="Heading 6 Char"/>
+    <w:basedOn w:val="DefaultParagraphFont"/>
+    <w:link w:val="Heading6"/>
+    <w:uiPriority w:val="9"/>
+    <w:semiHidden/>
+    <w:qFormat/>
+    <w:rsid w:val="005901b8"/>
+    <w:rPr>
+      <w:rFonts w:eastAsia="" w:cs="Angsana New" w:cstheme="majorBidi" w:eastAsiaTheme="majorEastAsia"/>
+      <w:i/>
+      <w:iCs/>
+      <w:color w:themeColor="text1" w:themeTint="a6" w:val="595959"/>
+    </w:rPr>
+  </w:style>
+  <w:style w:type="character" w:styleId="Heading7Char" w:customStyle="1">
+    <w:name w:val="Heading 7 Char"/>
+    <w:basedOn w:val="DefaultParagraphFont"/>
+    <w:link w:val="Heading7"/>
+    <w:uiPriority w:val="9"/>
+    <w:semiHidden/>
+    <w:qFormat/>
+    <w:rsid w:val="005901b8"/>
+    <w:rPr>
+      <w:rFonts w:eastAsia="" w:cs="Angsana New" w:cstheme="majorBidi" w:eastAsiaTheme="majorEastAsia"/>
+      <w:color w:themeColor="text1" w:themeTint="a6" w:val="595959"/>
+    </w:rPr>
+  </w:style>
+  <w:style w:type="character" w:styleId="Heading8Char" w:customStyle="1">
+    <w:name w:val="Heading 8 Char"/>
+    <w:basedOn w:val="DefaultParagraphFont"/>
+    <w:link w:val="Heading8"/>
+    <w:uiPriority w:val="9"/>
+    <w:semiHidden/>
+    <w:qFormat/>
+    <w:rsid w:val="005901b8"/>
+    <w:rPr>
+      <w:rFonts w:eastAsia="" w:cs="Angsana New" w:cstheme="majorBidi" w:eastAsiaTheme="majorEastAsia"/>
+      <w:i/>
+      <w:iCs/>
+      <w:color w:themeColor="text1" w:themeTint="d8" w:val="272727"/>
+    </w:rPr>
+  </w:style>
+  <w:style w:type="character" w:styleId="Heading9Char" w:customStyle="1">
+    <w:name w:val="Heading 9 Char"/>
+    <w:basedOn w:val="DefaultParagraphFont"/>
+    <w:link w:val="Heading9"/>
+    <w:uiPriority w:val="9"/>
+    <w:semiHidden/>
+    <w:qFormat/>
+    <w:rsid w:val="005901b8"/>
+    <w:rPr>
+      <w:rFonts w:eastAsia="" w:cs="Angsana New" w:cstheme="majorBidi" w:eastAsiaTheme="majorEastAsia"/>
+      <w:color w:themeColor="text1" w:themeTint="d8" w:val="272727"/>
+    </w:rPr>
+  </w:style>
+  <w:style w:type="character" w:styleId="TitleChar" w:customStyle="1">
+    <w:name w:val="Title Char"/>
+    <w:basedOn w:val="DefaultParagraphFont"/>
+    <w:link w:val="Title"/>
+    <w:uiPriority w:val="10"/>
+    <w:qFormat/>
+    <w:rsid w:val="005901b8"/>
+    <w:rPr>
+      <w:rFonts w:ascii="Aptos Display" w:hAnsi="Aptos Display" w:eastAsia="" w:cs="Angsana New" w:asciiTheme="majorHAnsi" w:cstheme="majorBidi" w:eastAsiaTheme="majorEastAsia" w:hAnsiTheme="majorHAnsi"/>
+      <w:spacing w:val="-10"/>
+      <w:kern w:val="2"/>
+      <w:sz w:val="56"/>
+      <w:szCs w:val="71"/>
+    </w:rPr>
+  </w:style>
+  <w:style w:type="character" w:styleId="SubtitleChar" w:customStyle="1">
+    <w:name w:val="Subtitle Char"/>
+    <w:basedOn w:val="DefaultParagraphFont"/>
+    <w:link w:val="Subtitle"/>
+    <w:uiPriority w:val="11"/>
+    <w:qFormat/>
+    <w:rsid w:val="005901b8"/>
+    <w:rPr>
+      <w:rFonts w:eastAsia="" w:cs="Angsana New" w:cstheme="majorBidi" w:eastAsiaTheme="majorEastAsia"/>
+      <w:color w:themeColor="text1" w:themeTint="a6" w:val="595959"/>
+      <w:spacing w:val="15"/>
+      <w:sz w:val="28"/>
+      <w:szCs w:val="35"/>
+    </w:rPr>
+  </w:style>
+  <w:style w:type="character" w:styleId="QuoteChar" w:customStyle="1">
+    <w:name w:val="Quote Char"/>
+    <w:basedOn w:val="DefaultParagraphFont"/>
+    <w:link w:val="Quote"/>
+    <w:uiPriority w:val="29"/>
+    <w:qFormat/>
+    <w:rsid w:val="005901b8"/>
+    <w:rPr>
+      <w:i/>
+      <w:iCs/>
+      <w:color w:themeColor="text1" w:themeTint="bf" w:val="404040"/>
+    </w:rPr>
+  </w:style>
+  <w:style w:type="character" w:styleId="IntenseEmphasis">
+    <w:name w:val="Intense Emphasis"/>
+    <w:basedOn w:val="DefaultParagraphFont"/>
+    <w:uiPriority w:val="21"/>
+    <w:qFormat/>
+    <w:rsid w:val="005901b8"/>
+    <w:rPr>
+      <w:i/>
+      <w:iCs/>
+      <w:color w:themeColor="accent1" w:themeShade="bf" w:val="0F4761"/>
+    </w:rPr>
+  </w:style>
+  <w:style w:type="character" w:styleId="IntenseQuoteChar" w:customStyle="1">
+    <w:name w:val="Intense Quote Char"/>
+    <w:basedOn w:val="DefaultParagraphFont"/>
+    <w:link w:val="IntenseQuote"/>
+    <w:uiPriority w:val="30"/>
+    <w:qFormat/>
+    <w:rsid w:val="005901b8"/>
+    <w:rPr>
+      <w:i/>
+      <w:iCs/>
+      <w:color w:themeColor="accent1" w:themeShade="bf" w:val="0F4761"/>
+    </w:rPr>
+  </w:style>
+  <w:style w:type="character" w:styleId="IntenseReference">
+    <w:name w:val="Intense Reference"/>
+    <w:basedOn w:val="DefaultParagraphFont"/>
+    <w:uiPriority w:val="32"/>
+    <w:qFormat/>
+    <w:rsid w:val="005901b8"/>
+    <w:rPr>
+      <w:b/>
+      <w:bCs/>
+      <w:smallCaps/>
+      <w:color w:themeColor="accent1" w:themeShade="bf" w:val="0F4761"/>
+      <w:spacing w:val="5"/>
+    </w:rPr>
+  </w:style>
+  <w:style w:type="paragraph" w:styleId="Heading">
+    <w:name w:val="Heading"/>
+    <w:basedOn w:val="Normal"/>
+    <w:next w:val="BodyText"/>
+    <w:qFormat/>
+    <w:pPr>
+      <w:keepNext w:val="true"/>
+      <w:spacing w:before="240" w:after="120"/>
+    </w:pPr>
+    <w:rPr>
+      <w:rFonts w:ascii="Liberation Sans" w:hAnsi="Liberation Sans" w:eastAsia="Noto Sans CJK SC" w:cs="Noto Sans Devanagari"/>
+      <w:sz w:val="28"/>
+      <w:szCs w:val="28"/>
+    </w:rPr>
+  </w:style>
+  <w:style w:type="paragraph" w:styleId="BodyText">
+    <w:name w:val="Body Text"/>
+    <w:basedOn w:val="Normal"/>
+    <w:pPr>
+      <w:spacing w:lineRule="auto" w:line="276" w:before="0" w:after="140"/>
+    </w:pPr>
+    <w:rPr/>
+  </w:style>
+  <w:style w:type="paragraph" w:styleId="List">
+    <w:name w:val="List"/>
+    <w:basedOn w:val="BodyText"/>
+    <w:pPr/>
+    <w:rPr>
+      <w:rFonts w:cs="Noto Sans Devanagari"/>
+    </w:rPr>
+  </w:style>
+  <w:style w:type="paragraph" w:styleId="Caption">
+    <w:name w:val="Caption"/>
+    <w:basedOn w:val="Normal"/>
+    <w:qFormat/>
+    <w:pPr>
+      <w:suppressLineNumbers/>
+      <w:spacing w:before="120" w:after="120"/>
+    </w:pPr>
+    <w:rPr>
+      <w:rFonts w:cs="Noto Sans Devanagari"/>
+      <w:i/>
+      <w:iCs/>
+      <w:sz w:val="24"/>
+      <w:szCs w:val="24"/>
+    </w:rPr>
+  </w:style>
+  <w:style w:type="paragraph" w:styleId="Index">
+    <w:name w:val="Index"/>
+    <w:basedOn w:val="Normal"/>
+    <w:qFormat/>
+    <w:pPr>
+      <w:suppressLineNumbers/>
+    </w:pPr>
+    <w:rPr>
+      <w:rFonts w:cs="Noto Sans Devanagari"/>
+    </w:rPr>
+  </w:style>
+  <w:style w:type="paragraph" w:styleId="Title">
+    <w:name w:val="Title"/>
+    <w:basedOn w:val="Normal"/>
+    <w:next w:val="Normal"/>
+    <w:link w:val="TitleChar"/>
+    <w:uiPriority w:val="10"/>
+    <w:qFormat/>
+    <w:rsid w:val="005901b8"/>
+    <w:pPr>
+      <w:spacing w:before="0" w:after="40"/>
+      <w:contextualSpacing/>
+    </w:pPr>
+    <w:rPr>
+      <w:rFonts w:ascii="Aptos Display" w:hAnsi="Aptos Display" w:eastAsia="" w:cs="Angsana New" w:asciiTheme="majorHAnsi" w:cstheme="majorBidi" w:eastAsiaTheme="majorEastAsia" w:hAnsiTheme="majorHAnsi"/>
+      <w:spacing w:val="-10"/>
+      <w:kern w:val="2"/>
+      <w:sz w:val="56"/>
+      <w:szCs w:val="71"/>
+    </w:rPr>
+  </w:style>
+  <w:style w:type="paragraph" w:styleId="Subtitle">
+    <w:name w:val="Subtitle"/>
+    <w:basedOn w:val="Normal"/>
+    <w:next w:val="Normal"/>
+    <w:link w:val="SubtitleChar"/>
+    <w:uiPriority w:val="11"/>
+    <w:qFormat/>
+    <w:rsid w:val="005901b8"/>
+    <w:pPr/>
+    <w:rPr>
+      <w:rFonts w:eastAsia="" w:cs="Angsana New" w:cstheme="majorBidi" w:eastAsiaTheme="majorEastAsia"/>
+      <w:color w:themeColor="text1" w:themeTint="a6" w:val="595959"/>
+      <w:spacing w:val="15"/>
+      <w:sz w:val="28"/>
+      <w:szCs w:val="35"/>
+    </w:rPr>
+  </w:style>
+  <w:style w:type="paragraph" w:styleId="Quote">
+    <w:name w:val="Quote"/>
+    <w:basedOn w:val="Normal"/>
+    <w:next w:val="Normal"/>
+    <w:link w:val="QuoteChar"/>
+    <w:uiPriority w:val="29"/>
+    <w:qFormat/>
+    <w:rsid w:val="005901b8"/>
+    <w:pPr>
+      <w:spacing w:before="160" w:after="160"/>
+      <w:jc w:val="center"/>
+    </w:pPr>
+    <w:rPr>
+      <w:i/>
+      <w:iCs/>
+      <w:color w:themeColor="text1" w:themeTint="bf" w:val="404040"/>
+    </w:rPr>
+  </w:style>
+  <w:style w:type="paragraph" w:styleId="ListParagraph">
+    <w:name w:val="List Paragraph"/>
+    <w:basedOn w:val="Normal"/>
+    <w:uiPriority w:val="34"/>
+    <w:qFormat/>
+    <w:rsid w:val="005901b8"/>
+    <w:pPr>
+      <w:spacing w:before="0" w:after="160"/>
+      <w:ind w:left="720"/>
+      <w:contextualSpacing/>
+    </w:pPr>
+    <w:rPr/>
+  </w:style>
+  <w:style w:type="paragraph" w:styleId="IntenseQuote">
+    <w:name w:val="Intense Quote"/>
+    <w:basedOn w:val="Normal"/>
+    <w:next w:val="Normal"/>
+    <w:link w:val="IntenseQuoteChar"/>
+    <w:uiPriority w:val="30"/>
+    <w:qFormat/>
+    <w:rsid w:val="005901b8"/>
+    <w:pPr>
+      <w:pBdr>
+        <w:top w:val="single" w:sz="4" w:space="10" w:color="0F4761" w:themeColor="accent1" w:themeShade="bf"/>
+        <w:bottom w:val="single" w:sz="4" w:space="10" w:color="0F4761" w:themeColor="accent1" w:themeShade="bf"/>
+      </w:pBdr>
+      <w:spacing w:before="360" w:after="360"/>
+      <w:ind w:left="864" w:right="864"/>
+      <w:jc w:val="center"/>
+    </w:pPr>
+    <w:rPr>
+      <w:i/>
+      <w:iCs/>
+      <w:color w:themeColor="accent1" w:themeShade="bf" w:val="0F4761"/>
+    </w:rPr>
+  </w:style>
+  <w:style w:type="paragraph" w:styleId="HeaderandFooter">
+    <w:name w:val="Header and Footer"/>
+    <w:basedOn w:val="Normal"/>
+    <w:qFormat/>
+    <w:pPr>
+      <w:suppressLineNumbers/>
+      <w:tabs>
+        <w:tab w:val="clear" w:pos="720"/>
+        <w:tab w:val="center" w:pos="4513" w:leader="none"/>
+        <w:tab w:val="right" w:pos="9026" w:leader="none"/>
+      </w:tabs>
+    </w:pPr>
+    <w:rPr/>
+  </w:style>
+  <w:style w:type="paragraph" w:styleId="Header">
+    <w:name w:val="Header"/>
+    <w:basedOn w:val="HeaderandFooter"/>
+    <w:pPr>
+      <w:suppressLineNumbers/>
+    </w:pPr>
+    <w:rPr/>
+  </w:style>
+  <w:style w:type="numbering" w:styleId="NoList" w:default="1">
+    <w:name w:val="No List"/>
+    <w:uiPriority w:val="99"/>
+    <w:semiHidden/>
+    <w:unhideWhenUsed/>
+    <w:qFormat/>
   </w:style>
   <w:style w:type="table" w:default="1" w:styleId="TableNormal">
     <w:name w:val="Normal Table"/>
@@ -1056,7 +1478,6 @@
     <w:semiHidden/>
     <w:unhideWhenUsed/>
     <w:tblPr>
-      <w:tblInd w:w="0" w:type="dxa"/>
       <w:tblCellMar>
         <w:top w:w="0" w:type="dxa"/>
         <w:left w:w="108" w:type="dxa"/>
@@ -1065,494 +1486,101 @@
       </w:tblCellMar>
     </w:tblPr>
   </w:style>
-  <w:style w:type="numbering" w:default="1" w:styleId="NoList">
-    <w:name w:val="No List"/>
-    <w:uiPriority w:val="99"/>
-    <w:semiHidden/>
-    <w:unhideWhenUsed/>
-  </w:style>
-  <w:style w:type="character" w:customStyle="1" w:styleId="Heading1Char">
-    <w:name w:val="Heading 1 Char"/>
-    <w:basedOn w:val="DefaultParagraphFont"/>
-    <w:link w:val="Heading1"/>
-    <w:uiPriority w:val="9"/>
-    <w:rsid w:val="005901B8"/>
-    <w:rPr>
-      <w:rFonts w:asciiTheme="majorHAnsi" w:eastAsiaTheme="majorEastAsia" w:hAnsiTheme="majorHAnsi" w:cstheme="majorBidi"/>
-      <w:color w:val="0F4761" w:themeColor="accent1" w:themeShade="BF"/>
-      <w:sz w:val="40"/>
-      <w:szCs w:val="50"/>
-    </w:rPr>
-  </w:style>
-  <w:style w:type="character" w:customStyle="1" w:styleId="Heading2Char">
-    <w:name w:val="Heading 2 Char"/>
-    <w:basedOn w:val="DefaultParagraphFont"/>
-    <w:link w:val="Heading2"/>
-    <w:uiPriority w:val="9"/>
-    <w:semiHidden/>
-    <w:rsid w:val="005901B8"/>
-    <w:rPr>
-      <w:rFonts w:asciiTheme="majorHAnsi" w:eastAsiaTheme="majorEastAsia" w:hAnsiTheme="majorHAnsi" w:cstheme="majorBidi"/>
-      <w:color w:val="0F4761" w:themeColor="accent1" w:themeShade="BF"/>
-      <w:sz w:val="32"/>
-      <w:szCs w:val="40"/>
-    </w:rPr>
-  </w:style>
-  <w:style w:type="character" w:customStyle="1" w:styleId="Heading3Char">
-    <w:name w:val="Heading 3 Char"/>
-    <w:basedOn w:val="DefaultParagraphFont"/>
-    <w:link w:val="Heading3"/>
-    <w:uiPriority w:val="9"/>
-    <w:rsid w:val="005901B8"/>
-    <w:rPr>
-      <w:rFonts w:eastAsiaTheme="majorEastAsia" w:cstheme="majorBidi"/>
-      <w:color w:val="0F4761" w:themeColor="accent1" w:themeShade="BF"/>
-      <w:sz w:val="28"/>
-      <w:szCs w:val="35"/>
-    </w:rPr>
-  </w:style>
-  <w:style w:type="character" w:customStyle="1" w:styleId="Heading4Char">
-    <w:name w:val="Heading 4 Char"/>
-    <w:basedOn w:val="DefaultParagraphFont"/>
-    <w:link w:val="Heading4"/>
-    <w:uiPriority w:val="9"/>
-    <w:semiHidden/>
-    <w:rsid w:val="005901B8"/>
-    <w:rPr>
-      <w:rFonts w:eastAsiaTheme="majorEastAsia" w:cstheme="majorBidi"/>
-      <w:i/>
-      <w:iCs/>
-      <w:color w:val="0F4761" w:themeColor="accent1" w:themeShade="BF"/>
-    </w:rPr>
-  </w:style>
-  <w:style w:type="character" w:customStyle="1" w:styleId="Heading5Char">
-    <w:name w:val="Heading 5 Char"/>
-    <w:basedOn w:val="DefaultParagraphFont"/>
-    <w:link w:val="Heading5"/>
-    <w:uiPriority w:val="9"/>
-    <w:semiHidden/>
-    <w:rsid w:val="005901B8"/>
-    <w:rPr>
-      <w:rFonts w:eastAsiaTheme="majorEastAsia" w:cstheme="majorBidi"/>
-      <w:color w:val="0F4761" w:themeColor="accent1" w:themeShade="BF"/>
-    </w:rPr>
-  </w:style>
-  <w:style w:type="character" w:customStyle="1" w:styleId="Heading6Char">
-    <w:name w:val="Heading 6 Char"/>
-    <w:basedOn w:val="DefaultParagraphFont"/>
-    <w:link w:val="Heading6"/>
-    <w:uiPriority w:val="9"/>
-    <w:semiHidden/>
-    <w:rsid w:val="005901B8"/>
-    <w:rPr>
-      <w:rFonts w:eastAsiaTheme="majorEastAsia" w:cstheme="majorBidi"/>
-      <w:i/>
-      <w:iCs/>
-      <w:color w:val="595959" w:themeColor="text1" w:themeTint="A6"/>
-    </w:rPr>
-  </w:style>
-  <w:style w:type="character" w:customStyle="1" w:styleId="Heading7Char">
-    <w:name w:val="Heading 7 Char"/>
-    <w:basedOn w:val="DefaultParagraphFont"/>
-    <w:link w:val="Heading7"/>
-    <w:uiPriority w:val="9"/>
-    <w:semiHidden/>
-    <w:rsid w:val="005901B8"/>
-    <w:rPr>
-      <w:rFonts w:eastAsiaTheme="majorEastAsia" w:cstheme="majorBidi"/>
-      <w:color w:val="595959" w:themeColor="text1" w:themeTint="A6"/>
-    </w:rPr>
-  </w:style>
-  <w:style w:type="character" w:customStyle="1" w:styleId="Heading8Char">
-    <w:name w:val="Heading 8 Char"/>
-    <w:basedOn w:val="DefaultParagraphFont"/>
-    <w:link w:val="Heading8"/>
-    <w:uiPriority w:val="9"/>
-    <w:semiHidden/>
-    <w:rsid w:val="005901B8"/>
-    <w:rPr>
-      <w:rFonts w:eastAsiaTheme="majorEastAsia" w:cstheme="majorBidi"/>
-      <w:i/>
-      <w:iCs/>
-      <w:color w:val="272727" w:themeColor="text1" w:themeTint="D8"/>
-    </w:rPr>
-  </w:style>
-  <w:style w:type="character" w:customStyle="1" w:styleId="Heading9Char">
-    <w:name w:val="Heading 9 Char"/>
-    <w:basedOn w:val="DefaultParagraphFont"/>
-    <w:link w:val="Heading9"/>
-    <w:uiPriority w:val="9"/>
-    <w:semiHidden/>
-    <w:rsid w:val="005901B8"/>
-    <w:rPr>
-      <w:rFonts w:eastAsiaTheme="majorEastAsia" w:cstheme="majorBidi"/>
-      <w:color w:val="272727" w:themeColor="text1" w:themeTint="D8"/>
-    </w:rPr>
-  </w:style>
-  <w:style w:type="paragraph" w:styleId="Title">
-    <w:name w:val="Title"/>
-    <w:basedOn w:val="Normal"/>
-    <w:next w:val="Normal"/>
-    <w:link w:val="TitleChar"/>
-    <w:uiPriority w:val="10"/>
-    <w:qFormat/>
-    <w:rsid w:val="005901B8"/>
-    <w:pPr>
-      <w:spacing w:after="40"/>
-      <w:contextualSpacing/>
-    </w:pPr>
-    <w:rPr>
-      <w:rFonts w:asciiTheme="majorHAnsi" w:eastAsiaTheme="majorEastAsia" w:hAnsiTheme="majorHAnsi" w:cstheme="majorBidi"/>
-      <w:spacing w:val="-10"/>
-      <w:kern w:val="28"/>
-      <w:sz w:val="56"/>
-      <w:szCs w:val="71"/>
-    </w:rPr>
-  </w:style>
-  <w:style w:type="character" w:customStyle="1" w:styleId="TitleChar">
-    <w:name w:val="Title Char"/>
-    <w:basedOn w:val="DefaultParagraphFont"/>
-    <w:link w:val="Title"/>
-    <w:uiPriority w:val="10"/>
-    <w:rsid w:val="005901B8"/>
-    <w:rPr>
-      <w:rFonts w:asciiTheme="majorHAnsi" w:eastAsiaTheme="majorEastAsia" w:hAnsiTheme="majorHAnsi" w:cstheme="majorBidi"/>
-      <w:spacing w:val="-10"/>
-      <w:kern w:val="28"/>
-      <w:sz w:val="56"/>
-      <w:szCs w:val="71"/>
-    </w:rPr>
-  </w:style>
-  <w:style w:type="paragraph" w:styleId="Subtitle">
-    <w:name w:val="Subtitle"/>
-    <w:basedOn w:val="Normal"/>
-    <w:next w:val="Normal"/>
-    <w:link w:val="SubtitleChar"/>
-    <w:uiPriority w:val="11"/>
-    <w:qFormat/>
-    <w:rsid w:val="005901B8"/>
-    <w:pPr>
-      <w:numPr>
-        <w:ilvl w:val="1"/>
-      </w:numPr>
-    </w:pPr>
-    <w:rPr>
-      <w:rFonts w:eastAsiaTheme="majorEastAsia" w:cstheme="majorBidi"/>
-      <w:color w:val="595959" w:themeColor="text1" w:themeTint="A6"/>
-      <w:spacing w:val="15"/>
-      <w:sz w:val="28"/>
-      <w:szCs w:val="35"/>
-    </w:rPr>
-  </w:style>
-  <w:style w:type="character" w:customStyle="1" w:styleId="SubtitleChar">
-    <w:name w:val="Subtitle Char"/>
-    <w:basedOn w:val="DefaultParagraphFont"/>
-    <w:link w:val="Subtitle"/>
-    <w:uiPriority w:val="11"/>
-    <w:rsid w:val="005901B8"/>
-    <w:rPr>
-      <w:rFonts w:eastAsiaTheme="majorEastAsia" w:cstheme="majorBidi"/>
-      <w:color w:val="595959" w:themeColor="text1" w:themeTint="A6"/>
-      <w:spacing w:val="15"/>
-      <w:sz w:val="28"/>
-      <w:szCs w:val="35"/>
-    </w:rPr>
-  </w:style>
-  <w:style w:type="paragraph" w:styleId="Quote">
-    <w:name w:val="Quote"/>
-    <w:basedOn w:val="Normal"/>
-    <w:next w:val="Normal"/>
-    <w:link w:val="QuoteChar"/>
-    <w:uiPriority w:val="29"/>
-    <w:qFormat/>
-    <w:rsid w:val="005901B8"/>
-    <w:pPr>
-      <w:spacing w:before="160"/>
-      <w:jc w:val="center"/>
-    </w:pPr>
-    <w:rPr>
-      <w:i/>
-      <w:iCs/>
-      <w:color w:val="404040" w:themeColor="text1" w:themeTint="BF"/>
-    </w:rPr>
-  </w:style>
-  <w:style w:type="character" w:customStyle="1" w:styleId="QuoteChar">
-    <w:name w:val="Quote Char"/>
-    <w:basedOn w:val="DefaultParagraphFont"/>
-    <w:link w:val="Quote"/>
-    <w:uiPriority w:val="29"/>
-    <w:rsid w:val="005901B8"/>
-    <w:rPr>
-      <w:i/>
-      <w:iCs/>
-      <w:color w:val="404040" w:themeColor="text1" w:themeTint="BF"/>
-    </w:rPr>
-  </w:style>
-  <w:style w:type="paragraph" w:styleId="ListParagraph">
-    <w:name w:val="List Paragraph"/>
-    <w:basedOn w:val="Normal"/>
-    <w:uiPriority w:val="34"/>
-    <w:qFormat/>
-    <w:rsid w:val="005901B8"/>
-    <w:pPr>
-      <w:ind w:left="720"/>
-      <w:contextualSpacing/>
-    </w:pPr>
-  </w:style>
-  <w:style w:type="character" w:styleId="IntenseEmphasis">
-    <w:name w:val="Intense Emphasis"/>
-    <w:basedOn w:val="DefaultParagraphFont"/>
-    <w:uiPriority w:val="21"/>
-    <w:qFormat/>
-    <w:rsid w:val="005901B8"/>
-    <w:rPr>
-      <w:i/>
-      <w:iCs/>
-      <w:color w:val="0F4761" w:themeColor="accent1" w:themeShade="BF"/>
-    </w:rPr>
-  </w:style>
-  <w:style w:type="paragraph" w:styleId="IntenseQuote">
-    <w:name w:val="Intense Quote"/>
-    <w:basedOn w:val="Normal"/>
-    <w:next w:val="Normal"/>
-    <w:link w:val="IntenseQuoteChar"/>
-    <w:uiPriority w:val="30"/>
-    <w:qFormat/>
-    <w:rsid w:val="005901B8"/>
-    <w:pPr>
-      <w:pBdr>
-        <w:top w:val="single" w:sz="4" w:space="10" w:color="0F4761" w:themeColor="accent1" w:themeShade="BF"/>
-        <w:bottom w:val="single" w:sz="4" w:space="10" w:color="0F4761" w:themeColor="accent1" w:themeShade="BF"/>
-      </w:pBdr>
-      <w:spacing w:before="360" w:after="360"/>
-      <w:ind w:left="864" w:right="864"/>
-      <w:jc w:val="center"/>
-    </w:pPr>
-    <w:rPr>
-      <w:i/>
-      <w:iCs/>
-      <w:color w:val="0F4761" w:themeColor="accent1" w:themeShade="BF"/>
-    </w:rPr>
-  </w:style>
-  <w:style w:type="character" w:customStyle="1" w:styleId="IntenseQuoteChar">
-    <w:name w:val="Intense Quote Char"/>
-    <w:basedOn w:val="DefaultParagraphFont"/>
-    <w:link w:val="IntenseQuote"/>
-    <w:uiPriority w:val="30"/>
-    <w:rsid w:val="005901B8"/>
-    <w:rPr>
-      <w:i/>
-      <w:iCs/>
-      <w:color w:val="0F4761" w:themeColor="accent1" w:themeShade="BF"/>
-    </w:rPr>
-  </w:style>
-  <w:style w:type="character" w:styleId="IntenseReference">
-    <w:name w:val="Intense Reference"/>
-    <w:basedOn w:val="DefaultParagraphFont"/>
-    <w:uiPriority w:val="32"/>
-    <w:qFormat/>
-    <w:rsid w:val="005901B8"/>
-    <w:rPr>
-      <w:b/>
-      <w:bCs/>
-      <w:smallCaps/>
-      <w:color w:val="0F4761" w:themeColor="accent1" w:themeShade="BF"/>
-      <w:spacing w:val="5"/>
-    </w:rPr>
-  </w:style>
 </w:styles>
 </file>
 
 <file path=word/theme/theme1.xml><?xml version="1.0" encoding="utf-8"?>
-<a:theme xmlns:a="http://schemas.openxmlformats.org/drawingml/2006/main" name="Office Theme">
+<a:theme xmlns:a="http://schemas.openxmlformats.org/drawingml/2006/main" xmlns:r="http://schemas.openxmlformats.org/officeDocument/2006/relationships" name="Office Theme">
   <a:themeElements>
     <a:clrScheme name="Office">
       <a:dk1>
-        <a:sysClr val="windowText" lastClr="000000"/>
+        <a:srgbClr val="000000"/>
       </a:dk1>
       <a:lt1>
-        <a:sysClr val="window" lastClr="FFFFFF"/>
+        <a:srgbClr val="ffffff"/>
       </a:lt1>
       <a:dk2>
-        <a:srgbClr val="0E2841"/>
+        <a:srgbClr val="0e2841"/>
       </a:dk2>
       <a:lt2>
-        <a:srgbClr val="E8E8E8"/>
+        <a:srgbClr val="e8e8e8"/>
       </a:lt2>
       <a:accent1>
         <a:srgbClr val="156082"/>
       </a:accent1>
       <a:accent2>
-        <a:srgbClr val="E97132"/>
+        <a:srgbClr val="e97132"/>
       </a:accent2>
       <a:accent3>
-        <a:srgbClr val="196B24"/>
+        <a:srgbClr val="196b24"/>
       </a:accent3>
       <a:accent4>
-        <a:srgbClr val="0F9ED5"/>
+        <a:srgbClr val="0f9ed5"/>
       </a:accent4>
       <a:accent5>
-        <a:srgbClr val="A02B93"/>
+        <a:srgbClr val="a02b93"/>
       </a:accent5>
       <a:accent6>
-        <a:srgbClr val="4EA72E"/>
+        <a:srgbClr val="4ea72e"/>
       </a:accent6>
       <a:hlink>
         <a:srgbClr val="467886"/>
       </a:hlink>
       <a:folHlink>
-        <a:srgbClr val="96607D"/>
+        <a:srgbClr val="96607d"/>
       </a:folHlink>
     </a:clrScheme>
     <a:fontScheme name="Office">
       <a:majorFont>
-        <a:latin typeface="Aptos Display" panose="02110004020202020204"/>
+        <a:latin typeface="Aptos Display" panose="02110004020202020204" pitchFamily="0" charset="1"/>
         <a:ea typeface=""/>
         <a:cs typeface=""/>
-        <a:font script="Jpan" typeface="游ゴシック Light"/>
-        <a:font script="Hang" typeface="맑은 고딕"/>
-        <a:font script="Hans" typeface="等线 Light"/>
-        <a:font script="Hant" typeface="新細明體"/>
-        <a:font script="Arab" typeface="Times New Roman"/>
-        <a:font script="Hebr" typeface="Times New Roman"/>
-        <a:font script="Thai" typeface="Angsana New"/>
-        <a:font script="Ethi" typeface="Nyala"/>
-        <a:font script="Beng" typeface="Vrinda"/>
-        <a:font script="Gujr" typeface="Shruti"/>
-        <a:font script="Khmr" typeface="MoolBoran"/>
-        <a:font script="Knda" typeface="Tunga"/>
-        <a:font script="Guru" typeface="Raavi"/>
-        <a:font script="Cans" typeface="Euphemia"/>
-        <a:font script="Cher" typeface="Plantagenet Cherokee"/>
-        <a:font script="Yiii" typeface="Microsoft Yi Baiti"/>
-        <a:font script="Tibt" typeface="Microsoft Himalaya"/>
-        <a:font script="Thaa" typeface="MV Boli"/>
-        <a:font script="Deva" typeface="Mangal"/>
-        <a:font script="Telu" typeface="Gautami"/>
-        <a:font script="Taml" typeface="Latha"/>
-        <a:font script="Syrc" typeface="Estrangelo Edessa"/>
-        <a:font script="Orya" typeface="Kalinga"/>
-        <a:font script="Mlym" typeface="Kartika"/>
-        <a:font script="Laoo" typeface="DokChampa"/>
-        <a:font script="Sinh" typeface="Iskoola Pota"/>
-        <a:font script="Mong" typeface="Mongolian Baiti"/>
-        <a:font script="Viet" typeface="Times New Roman"/>
-        <a:font script="Uigh" typeface="Microsoft Uighur"/>
-        <a:font script="Geor" typeface="Sylfaen"/>
-        <a:font script="Armn" typeface="Arial"/>
-        <a:font script="Bugi" typeface="Leelawadee UI"/>
-        <a:font script="Bopo" typeface="Microsoft JhengHei"/>
-        <a:font script="Java" typeface="Javanese Text"/>
-        <a:font script="Lisu" typeface="Segoe UI"/>
-        <a:font script="Mymr" typeface="Myanmar Text"/>
-        <a:font script="Nkoo" typeface="Ebrima"/>
-        <a:font script="Olck" typeface="Nirmala UI"/>
-        <a:font script="Osma" typeface="Ebrima"/>
-        <a:font script="Phag" typeface="Phagspa"/>
-        <a:font script="Syrn" typeface="Estrangelo Edessa"/>
-        <a:font script="Syrj" typeface="Estrangelo Edessa"/>
-        <a:font script="Syre" typeface="Estrangelo Edessa"/>
-        <a:font script="Sora" typeface="Nirmala UI"/>
-        <a:font script="Tale" typeface="Microsoft Tai Le"/>
-        <a:font script="Talu" typeface="Microsoft New Tai Lue"/>
-        <a:font script="Tfng" typeface="Ebrima"/>
       </a:majorFont>
       <a:minorFont>
-        <a:latin typeface="Aptos" panose="02110004020202020204"/>
+        <a:latin typeface="Aptos" panose="02110004020202020204" pitchFamily="0" charset="1"/>
         <a:ea typeface=""/>
         <a:cs typeface=""/>
-        <a:font script="Jpan" typeface="游明朝"/>
-        <a:font script="Hang" typeface="맑은 고딕"/>
-        <a:font script="Hans" typeface="等线"/>
-        <a:font script="Hant" typeface="新細明體"/>
-        <a:font script="Arab" typeface="Arial"/>
-        <a:font script="Hebr" typeface="Arial"/>
-        <a:font script="Thai" typeface="Cordia New"/>
-        <a:font script="Ethi" typeface="Nyala"/>
-        <a:font script="Beng" typeface="Vrinda"/>
-        <a:font script="Gujr" typeface="Shruti"/>
-        <a:font script="Khmr" typeface="DaunPenh"/>
-        <a:font script="Knda" typeface="Tunga"/>
-        <a:font script="Guru" typeface="Raavi"/>
-        <a:font script="Cans" typeface="Euphemia"/>
-        <a:font script="Cher" typeface="Plantagenet Cherokee"/>
-        <a:font script="Yiii" typeface="Microsoft Yi Baiti"/>
-        <a:font script="Tibt" typeface="Microsoft Himalaya"/>
-        <a:font script="Thaa" typeface="MV Boli"/>
-        <a:font script="Deva" typeface="Mangal"/>
-        <a:font script="Telu" typeface="Gautami"/>
-        <a:font script="Taml" typeface="Latha"/>
-        <a:font script="Syrc" typeface="Estrangelo Edessa"/>
-        <a:font script="Orya" typeface="Kalinga"/>
-        <a:font script="Mlym" typeface="Kartika"/>
-        <a:font script="Laoo" typeface="DokChampa"/>
-        <a:font script="Sinh" typeface="Iskoola Pota"/>
-        <a:font script="Mong" typeface="Mongolian Baiti"/>
-        <a:font script="Viet" typeface="Arial"/>
-        <a:font script="Uigh" typeface="Microsoft Uighur"/>
-        <a:font script="Geor" typeface="Sylfaen"/>
-        <a:font script="Armn" typeface="Arial"/>
-        <a:font script="Bugi" typeface="Leelawadee UI"/>
-        <a:font script="Bopo" typeface="Microsoft JhengHei"/>
-        <a:font script="Java" typeface="Javanese Text"/>
-        <a:font script="Lisu" typeface="Segoe UI"/>
-        <a:font script="Mymr" typeface="Myanmar Text"/>
-        <a:font script="Nkoo" typeface="Ebrima"/>
-        <a:font script="Olck" typeface="Nirmala UI"/>
-        <a:font script="Osma" typeface="Ebrima"/>
-        <a:font script="Phag" typeface="Phagspa"/>
-        <a:font script="Syrn" typeface="Estrangelo Edessa"/>
-        <a:font script="Syrj" typeface="Estrangelo Edessa"/>
-        <a:font script="Syre" typeface="Estrangelo Edessa"/>
-        <a:font script="Sora" typeface="Nirmala UI"/>
-        <a:font script="Tale" typeface="Microsoft Tai Le"/>
-        <a:font script="Talu" typeface="Microsoft New Tai Lue"/>
-        <a:font script="Tfng" typeface="Ebrima"/>
       </a:minorFont>
     </a:fontScheme>
-    <a:fmtScheme name="Office">
+    <a:fmtScheme>
       <a:fillStyleLst>
         <a:solidFill>
           <a:schemeClr val="phClr"/>
         </a:solidFill>
-        <a:gradFill rotWithShape="1">
+        <a:gradFill>
           <a:gsLst>
             <a:gs pos="0">
               <a:schemeClr val="phClr">
                 <a:lumMod val="110000"/>
-                <a:satMod val="105000"/>
                 <a:tint val="67000"/>
               </a:schemeClr>
             </a:gs>
             <a:gs pos="50000">
               <a:schemeClr val="phClr">
                 <a:lumMod val="105000"/>
-                <a:satMod val="103000"/>
                 <a:tint val="73000"/>
               </a:schemeClr>
             </a:gs>
             <a:gs pos="100000">
               <a:schemeClr val="phClr">
                 <a:lumMod val="105000"/>
-                <a:satMod val="109000"/>
                 <a:tint val="81000"/>
               </a:schemeClr>
             </a:gs>
           </a:gsLst>
           <a:lin ang="5400000" scaled="0"/>
+          <a:tileRect l="0" t="0" r="0" b="0"/>
         </a:gradFill>
-        <a:gradFill rotWithShape="1">
+        <a:gradFill>
           <a:gsLst>
             <a:gs pos="0">
               <a:schemeClr val="phClr">
-                <a:satMod val="103000"/>
                 <a:lumMod val="102000"/>
                 <a:tint val="94000"/>
               </a:schemeClr>
             </a:gs>
             <a:gs pos="50000">
               <a:schemeClr val="phClr">
-                <a:satMod val="110000"/>
                 <a:lumMod val="100000"/>
                 <a:shade val="100000"/>
               </a:schemeClr>
@@ -1560,33 +1588,24 @@
             <a:gs pos="100000">
               <a:schemeClr val="phClr">
                 <a:lumMod val="99000"/>
-                <a:satMod val="120000"/>
                 <a:shade val="78000"/>
               </a:schemeClr>
             </a:gs>
           </a:gsLst>
           <a:lin ang="5400000" scaled="0"/>
+          <a:tileRect l="0" t="0" r="0" b="0"/>
         </a:gradFill>
       </a:fillStyleLst>
       <a:lnStyleLst>
         <a:ln w="12700" cap="flat" cmpd="sng" algn="ctr">
-          <a:solidFill>
-            <a:schemeClr val="phClr"/>
-          </a:solidFill>
           <a:prstDash val="solid"/>
           <a:miter lim="800000"/>
         </a:ln>
         <a:ln w="19050" cap="flat" cmpd="sng" algn="ctr">
-          <a:solidFill>
-            <a:schemeClr val="phClr"/>
-          </a:solidFill>
           <a:prstDash val="solid"/>
           <a:miter lim="800000"/>
         </a:ln>
         <a:ln w="25400" cap="flat" cmpd="sng" algn="ctr">
-          <a:solidFill>
-            <a:schemeClr val="phClr"/>
-          </a:solidFill>
           <a:prstDash val="solid"/>
           <a:miter lim="800000"/>
         </a:ln>
@@ -1599,13 +1618,7 @@
           <a:effectLst/>
         </a:effectStyle>
         <a:effectStyle>
-          <a:effectLst>
-            <a:outerShdw blurRad="57150" dist="19050" dir="5400000" algn="ctr" rotWithShape="0">
-              <a:srgbClr val="000000">
-                <a:alpha val="63000"/>
-              </a:srgbClr>
-            </a:outerShdw>
-          </a:effectLst>
+          <a:effectLst/>
         </a:effectStyle>
       </a:effectStyleLst>
       <a:bgFillStyleLst>
@@ -1615,15 +1628,13 @@
         <a:solidFill>
           <a:schemeClr val="phClr">
             <a:tint val="95000"/>
-            <a:satMod val="170000"/>
           </a:schemeClr>
         </a:solidFill>
-        <a:gradFill rotWithShape="1">
+        <a:gradFill>
           <a:gsLst>
             <a:gs pos="0">
               <a:schemeClr val="phClr">
                 <a:tint val="93000"/>
-                <a:satMod val="150000"/>
                 <a:shade val="98000"/>
                 <a:lumMod val="102000"/>
               </a:schemeClr>
@@ -1631,7 +1642,6 @@
             <a:gs pos="50000">
               <a:schemeClr val="phClr">
                 <a:tint val="98000"/>
-                <a:satMod val="130000"/>
                 <a:shade val="90000"/>
                 <a:lumMod val="103000"/>
               </a:schemeClr>
@@ -1639,41 +1649,14 @@
             <a:gs pos="100000">
               <a:schemeClr val="phClr">
                 <a:shade val="63000"/>
-                <a:satMod val="120000"/>
               </a:schemeClr>
             </a:gs>
           </a:gsLst>
           <a:lin ang="5400000" scaled="0"/>
+          <a:tileRect l="0" t="0" r="0" b="0"/>
         </a:gradFill>
       </a:bgFillStyleLst>
     </a:fmtScheme>
   </a:themeElements>
-  <a:objectDefaults>
-    <a:lnDef>
-      <a:spPr/>
-      <a:bodyPr/>
-      <a:lstStyle/>
-      <a:style>
-        <a:lnRef idx="2">
-          <a:schemeClr val="accent1"/>
-        </a:lnRef>
-        <a:fillRef idx="0">
-          <a:schemeClr val="accent1"/>
-        </a:fillRef>
-        <a:effectRef idx="1">
-          <a:schemeClr val="accent1"/>
-        </a:effectRef>
-        <a:fontRef idx="minor">
-          <a:schemeClr val="tx1"/>
-        </a:fontRef>
-      </a:style>
-    </a:lnDef>
-  </a:objectDefaults>
-  <a:extraClrSchemeLst/>
-  <a:extLst>
-    <a:ext uri="{05A4C25C-085E-4340-85A3-A5531E510DB2}">
-      <thm15:themeFamily xmlns:thm15="http://schemas.microsoft.com/office/thememl/2012/main" name="Office Theme" id="{2E142A2C-CD16-42D6-873A-C26D2A0506FA}" vid="{1BDDFF52-6CD6-40A5-AB3C-68EB2F1E4D0A}"/>
-    </a:ext>
-  </a:extLst>
 </a:theme>
 </file>
</xml_diff>